<commit_message>
Add anomaly labelling/detection, MLflow tracking, transaction data dictionary, demo script; refresh results and docs
</commit_message>
<xml_diff>
--- a/CLV_Project_Report.docx
+++ b/CLV_Project_Report.docx
@@ -103,6 +103,9 @@
             </w:tcMar>
           </w:tcPr>
           <w:p>
+            <w:pPr>
+              <w:keepNext/>
+            </w:pPr>
             <w:r>
               <w:rPr>
                 <w:rFonts w:ascii="Arial" w:cs="Arial" w:eastAsia="Arial" w:hAnsi="Arial"/>
@@ -133,6 +136,9 @@
             </w:tcMar>
           </w:tcPr>
           <w:p>
+            <w:pPr>
+              <w:keepNext/>
+            </w:pPr>
             <w:r>
               <w:rPr>
                 <w:rFonts w:ascii="Arial" w:cs="Arial" w:eastAsia="Arial" w:hAnsi="Arial"/>
@@ -167,6 +173,9 @@
             </w:tcMar>
           </w:tcPr>
           <w:p>
+            <w:pPr>
+              <w:keepNext/>
+            </w:pPr>
             <w:r>
               <w:rPr>
                 <w:rFonts w:ascii="Arial" w:cs="Arial" w:eastAsia="Arial" w:hAnsi="Arial"/>
@@ -196,6 +205,9 @@
             </w:tcMar>
           </w:tcPr>
           <w:p>
+            <w:pPr>
+              <w:keepNext/>
+            </w:pPr>
             <w:r>
               <w:rPr>
                 <w:rFonts w:ascii="Arial" w:cs="Arial" w:eastAsia="Arial" w:hAnsi="Arial"/>
@@ -230,6 +242,9 @@
             </w:tcMar>
           </w:tcPr>
           <w:p>
+            <w:pPr>
+              <w:keepNext/>
+            </w:pPr>
             <w:r>
               <w:rPr>
                 <w:rFonts w:ascii="Arial" w:cs="Arial" w:eastAsia="Arial" w:hAnsi="Arial"/>
@@ -259,6 +274,9 @@
             </w:tcMar>
           </w:tcPr>
           <w:p>
+            <w:pPr>
+              <w:keepNext/>
+            </w:pPr>
             <w:r>
               <w:rPr>
                 <w:rFonts w:ascii="Arial" w:cs="Arial" w:eastAsia="Arial" w:hAnsi="Arial"/>
@@ -293,6 +311,9 @@
             </w:tcMar>
           </w:tcPr>
           <w:p>
+            <w:pPr>
+              <w:keepNext/>
+            </w:pPr>
             <w:r>
               <w:rPr>
                 <w:rFonts w:ascii="Arial" w:cs="Arial" w:eastAsia="Arial" w:hAnsi="Arial"/>
@@ -322,6 +343,9 @@
             </w:tcMar>
           </w:tcPr>
           <w:p>
+            <w:pPr>
+              <w:keepNext/>
+            </w:pPr>
             <w:r>
               <w:rPr>
                 <w:rFonts w:ascii="Arial" w:cs="Arial" w:eastAsia="Arial" w:hAnsi="Arial"/>
@@ -356,6 +380,9 @@
             </w:tcMar>
           </w:tcPr>
           <w:p>
+            <w:pPr>
+              <w:keepNext/>
+            </w:pPr>
             <w:r>
               <w:rPr>
                 <w:rFonts w:ascii="Arial" w:cs="Arial" w:eastAsia="Arial" w:hAnsi="Arial"/>
@@ -385,6 +412,9 @@
             </w:tcMar>
           </w:tcPr>
           <w:p>
+            <w:pPr>
+              <w:keepNext/>
+            </w:pPr>
             <w:r>
               <w:rPr>
                 <w:rFonts w:ascii="Arial" w:cs="Arial" w:eastAsia="Arial" w:hAnsi="Arial"/>
@@ -419,6 +449,9 @@
             </w:tcMar>
           </w:tcPr>
           <w:p>
+            <w:pPr>
+              <w:keepNext w:val="false"/>
+            </w:pPr>
             <w:r>
               <w:rPr>
                 <w:rFonts w:ascii="Arial" w:cs="Arial" w:eastAsia="Arial" w:hAnsi="Arial"/>
@@ -448,6 +481,9 @@
             </w:tcMar>
           </w:tcPr>
           <w:p>
+            <w:pPr>
+              <w:keepNext w:val="false"/>
+            </w:pPr>
             <w:r>
               <w:rPr>
                 <w:rFonts w:ascii="Arial" w:cs="Arial" w:eastAsia="Arial" w:hAnsi="Arial"/>
@@ -470,6 +506,7 @@
     <w:p>
       <w:pPr>
         <w:pStyle w:val="Heading1"/>
+        <w:keepNext/>
         <w:spacing w:after="160" w:before="320"/>
       </w:pPr>
       <w:r>
@@ -523,12 +560,13 @@
           <w:sz w:val="21"/>
           <w:szCs w:val="21"/>
         </w:rPr>
-        <w:t xml:space="preserve">Because the brief calls for BG/NBD, which needs purchase histories, a second dataset of 5,000 customers and 30,318 transactions over three years was simulated. BG/NBD and Gamma-Gamma were fitted on the first two years and tested on the third: predicted repeat purchases were within 3.3% of actual, and the top 10% of customers ranked by predicted CLV captured 50.4% of next-year spend (47.3% for gradient boosting on RFM features). Customers were then grouped into five retention actions using probability of being active and 12-month CLV. Both datasets are synthetic, so the results validate the method and code rather than predict real customer behaviour.</w:t>
+        <w:t xml:space="preserve">Because the brief calls for BG/NBD, which needs purchase histories, a second dataset of 5,000 customers and about 31,000 transactions over three years was simulated, with 3% of rows deliberately corrupted and labelled as anomalies; a label-free detection rule found all of them (95% precision) and removed them. BG/NBD and Gamma-Gamma were fitted on the first two years and tested on the third: predicted repeat purchases were within 3.2% of actual, and the top 10% of customers ranked by predicted CLV captured 52.2% of next-year spend (47.1% for gradient boosting on RFM features). Customers were then grouped into five retention actions using probability of being active and 12-month CLV. Both datasets are synthetic, so the results validate the method and code rather than predict real customer behaviour.</w:t>
       </w:r>
     </w:p>
     <w:p>
       <w:pPr>
         <w:pStyle w:val="Heading1"/>
+        <w:keepNext/>
         <w:spacing w:after="160" w:before="320"/>
       </w:pPr>
       <w:r>
@@ -546,6 +584,7 @@
     <w:p>
       <w:pPr>
         <w:pStyle w:val="Heading2"/>
+        <w:keepNext/>
         <w:spacing w:after="100" w:before="200"/>
       </w:pPr>
       <w:r>
@@ -577,6 +616,7 @@
     <w:p>
       <w:pPr>
         <w:pStyle w:val="Heading2"/>
+        <w:keepNext/>
         <w:spacing w:after="100" w:before="200"/>
       </w:pPr>
       <w:r>
@@ -608,6 +648,7 @@
     <w:p>
       <w:pPr>
         <w:pStyle w:val="Heading2"/>
+        <w:keepNext/>
         <w:spacing w:after="100" w:before="200"/>
       </w:pPr>
       <w:r>
@@ -733,6 +774,7 @@
     <w:p>
       <w:pPr>
         <w:pStyle w:val="Heading1"/>
+        <w:keepNext/>
         <w:spacing w:after="160" w:before="320"/>
       </w:pPr>
       <w:r>
@@ -750,6 +792,7 @@
     <w:p>
       <w:pPr>
         <w:pStyle w:val="Heading2"/>
+        <w:keepNext/>
         <w:spacing w:after="100" w:before="200"/>
       </w:pPr>
       <w:r>
@@ -775,7 +818,7 @@
           <w:sz w:val="21"/>
           <w:szCs w:val="21"/>
         </w:rPr>
-        <w:t xml:space="preserve">The project uses dataset.csv from the programme folder: 500 customers (one row each) and 8 columns, with no missing values and no duplicate customer IDs. A data dictionary describing every column was completed as part of this work (data_dictionary.csv).</w:t>
+        <w:t xml:space="preserve">The project uses dataset.csv from the programme folder: 500 customers (one row each) and 8 columns, with no missing values and no duplicate customer IDs. A data dictionary describing every column was completed as part of this work (data_dictionary.csv; data_dictionary_transactions.csv covers the transaction and CLV files).</w:t>
       </w:r>
     </w:p>
     <w:tbl>
@@ -817,6 +860,9 @@
             </w:tcMar>
           </w:tcPr>
           <w:p>
+            <w:pPr>
+              <w:keepNext/>
+            </w:pPr>
             <w:r>
               <w:rPr>
                 <w:rFonts w:ascii="Arial" w:cs="Arial" w:eastAsia="Arial" w:hAnsi="Arial"/>
@@ -847,6 +893,9 @@
             </w:tcMar>
           </w:tcPr>
           <w:p>
+            <w:pPr>
+              <w:keepNext/>
+            </w:pPr>
             <w:r>
               <w:rPr>
                 <w:rFonts w:ascii="Arial" w:cs="Arial" w:eastAsia="Arial" w:hAnsi="Arial"/>
@@ -877,6 +926,9 @@
             </w:tcMar>
           </w:tcPr>
           <w:p>
+            <w:pPr>
+              <w:keepNext/>
+            </w:pPr>
             <w:r>
               <w:rPr>
                 <w:rFonts w:ascii="Arial" w:cs="Arial" w:eastAsia="Arial" w:hAnsi="Arial"/>
@@ -911,6 +963,9 @@
             </w:tcMar>
           </w:tcPr>
           <w:p>
+            <w:pPr>
+              <w:keepNext/>
+            </w:pPr>
             <w:r>
               <w:rPr>
                 <w:rFonts w:ascii="Arial" w:cs="Arial" w:eastAsia="Arial" w:hAnsi="Arial"/>
@@ -940,6 +995,9 @@
             </w:tcMar>
           </w:tcPr>
           <w:p>
+            <w:pPr>
+              <w:keepNext/>
+            </w:pPr>
             <w:r>
               <w:rPr>
                 <w:rFonts w:ascii="Arial" w:cs="Arial" w:eastAsia="Arial" w:hAnsi="Arial"/>
@@ -969,6 +1027,9 @@
             </w:tcMar>
           </w:tcPr>
           <w:p>
+            <w:pPr>
+              <w:keepNext/>
+            </w:pPr>
             <w:r>
               <w:rPr>
                 <w:rFonts w:ascii="Arial" w:cs="Arial" w:eastAsia="Arial" w:hAnsi="Arial"/>
@@ -1003,6 +1064,9 @@
             </w:tcMar>
           </w:tcPr>
           <w:p>
+            <w:pPr>
+              <w:keepNext/>
+            </w:pPr>
             <w:r>
               <w:rPr>
                 <w:rFonts w:ascii="Arial" w:cs="Arial" w:eastAsia="Arial" w:hAnsi="Arial"/>
@@ -1032,6 +1096,9 @@
             </w:tcMar>
           </w:tcPr>
           <w:p>
+            <w:pPr>
+              <w:keepNext/>
+            </w:pPr>
             <w:r>
               <w:rPr>
                 <w:rFonts w:ascii="Arial" w:cs="Arial" w:eastAsia="Arial" w:hAnsi="Arial"/>
@@ -1061,6 +1128,9 @@
             </w:tcMar>
           </w:tcPr>
           <w:p>
+            <w:pPr>
+              <w:keepNext/>
+            </w:pPr>
             <w:r>
               <w:rPr>
                 <w:rFonts w:ascii="Arial" w:cs="Arial" w:eastAsia="Arial" w:hAnsi="Arial"/>
@@ -1095,6 +1165,9 @@
             </w:tcMar>
           </w:tcPr>
           <w:p>
+            <w:pPr>
+              <w:keepNext/>
+            </w:pPr>
             <w:r>
               <w:rPr>
                 <w:rFonts w:ascii="Arial" w:cs="Arial" w:eastAsia="Arial" w:hAnsi="Arial"/>
@@ -1124,6 +1197,9 @@
             </w:tcMar>
           </w:tcPr>
           <w:p>
+            <w:pPr>
+              <w:keepNext/>
+            </w:pPr>
             <w:r>
               <w:rPr>
                 <w:rFonts w:ascii="Arial" w:cs="Arial" w:eastAsia="Arial" w:hAnsi="Arial"/>
@@ -1153,6 +1229,9 @@
             </w:tcMar>
           </w:tcPr>
           <w:p>
+            <w:pPr>
+              <w:keepNext/>
+            </w:pPr>
             <w:r>
               <w:rPr>
                 <w:rFonts w:ascii="Arial" w:cs="Arial" w:eastAsia="Arial" w:hAnsi="Arial"/>
@@ -1187,6 +1266,9 @@
             </w:tcMar>
           </w:tcPr>
           <w:p>
+            <w:pPr>
+              <w:keepNext/>
+            </w:pPr>
             <w:r>
               <w:rPr>
                 <w:rFonts w:ascii="Arial" w:cs="Arial" w:eastAsia="Arial" w:hAnsi="Arial"/>
@@ -1216,6 +1298,9 @@
             </w:tcMar>
           </w:tcPr>
           <w:p>
+            <w:pPr>
+              <w:keepNext/>
+            </w:pPr>
             <w:r>
               <w:rPr>
                 <w:rFonts w:ascii="Arial" w:cs="Arial" w:eastAsia="Arial" w:hAnsi="Arial"/>
@@ -1245,6 +1330,9 @@
             </w:tcMar>
           </w:tcPr>
           <w:p>
+            <w:pPr>
+              <w:keepNext/>
+            </w:pPr>
             <w:r>
               <w:rPr>
                 <w:rFonts w:ascii="Arial" w:cs="Arial" w:eastAsia="Arial" w:hAnsi="Arial"/>
@@ -1279,6 +1367,9 @@
             </w:tcMar>
           </w:tcPr>
           <w:p>
+            <w:pPr>
+              <w:keepNext/>
+            </w:pPr>
             <w:r>
               <w:rPr>
                 <w:rFonts w:ascii="Arial" w:cs="Arial" w:eastAsia="Arial" w:hAnsi="Arial"/>
@@ -1308,6 +1399,9 @@
             </w:tcMar>
           </w:tcPr>
           <w:p>
+            <w:pPr>
+              <w:keepNext/>
+            </w:pPr>
             <w:r>
               <w:rPr>
                 <w:rFonts w:ascii="Arial" w:cs="Arial" w:eastAsia="Arial" w:hAnsi="Arial"/>
@@ -1337,6 +1431,9 @@
             </w:tcMar>
           </w:tcPr>
           <w:p>
+            <w:pPr>
+              <w:keepNext/>
+            </w:pPr>
             <w:r>
               <w:rPr>
                 <w:rFonts w:ascii="Arial" w:cs="Arial" w:eastAsia="Arial" w:hAnsi="Arial"/>
@@ -1371,6 +1468,9 @@
             </w:tcMar>
           </w:tcPr>
           <w:p>
+            <w:pPr>
+              <w:keepNext/>
+            </w:pPr>
             <w:r>
               <w:rPr>
                 <w:rFonts w:ascii="Arial" w:cs="Arial" w:eastAsia="Arial" w:hAnsi="Arial"/>
@@ -1400,6 +1500,9 @@
             </w:tcMar>
           </w:tcPr>
           <w:p>
+            <w:pPr>
+              <w:keepNext/>
+            </w:pPr>
             <w:r>
               <w:rPr>
                 <w:rFonts w:ascii="Arial" w:cs="Arial" w:eastAsia="Arial" w:hAnsi="Arial"/>
@@ -1429,6 +1532,9 @@
             </w:tcMar>
           </w:tcPr>
           <w:p>
+            <w:pPr>
+              <w:keepNext/>
+            </w:pPr>
             <w:r>
               <w:rPr>
                 <w:rFonts w:ascii="Arial" w:cs="Arial" w:eastAsia="Arial" w:hAnsi="Arial"/>
@@ -1463,6 +1569,9 @@
             </w:tcMar>
           </w:tcPr>
           <w:p>
+            <w:pPr>
+              <w:keepNext/>
+            </w:pPr>
             <w:r>
               <w:rPr>
                 <w:rFonts w:ascii="Arial" w:cs="Arial" w:eastAsia="Arial" w:hAnsi="Arial"/>
@@ -1492,6 +1601,9 @@
             </w:tcMar>
           </w:tcPr>
           <w:p>
+            <w:pPr>
+              <w:keepNext/>
+            </w:pPr>
             <w:r>
               <w:rPr>
                 <w:rFonts w:ascii="Arial" w:cs="Arial" w:eastAsia="Arial" w:hAnsi="Arial"/>
@@ -1521,6 +1633,9 @@
             </w:tcMar>
           </w:tcPr>
           <w:p>
+            <w:pPr>
+              <w:keepNext/>
+            </w:pPr>
             <w:r>
               <w:rPr>
                 <w:rFonts w:ascii="Arial" w:cs="Arial" w:eastAsia="Arial" w:hAnsi="Arial"/>
@@ -1555,6 +1670,9 @@
             </w:tcMar>
           </w:tcPr>
           <w:p>
+            <w:pPr>
+              <w:keepNext w:val="false"/>
+            </w:pPr>
             <w:r>
               <w:rPr>
                 <w:rFonts w:ascii="Arial" w:cs="Arial" w:eastAsia="Arial" w:hAnsi="Arial"/>
@@ -1584,6 +1702,9 @@
             </w:tcMar>
           </w:tcPr>
           <w:p>
+            <w:pPr>
+              <w:keepNext w:val="false"/>
+            </w:pPr>
             <w:r>
               <w:rPr>
                 <w:rFonts w:ascii="Arial" w:cs="Arial" w:eastAsia="Arial" w:hAnsi="Arial"/>
@@ -1613,6 +1734,9 @@
             </w:tcMar>
           </w:tcPr>
           <w:p>
+            <w:pPr>
+              <w:keepNext w:val="false"/>
+            </w:pPr>
             <w:r>
               <w:rPr>
                 <w:rFonts w:ascii="Arial" w:cs="Arial" w:eastAsia="Arial" w:hAnsi="Arial"/>
@@ -1635,6 +1759,7 @@
     <w:p>
       <w:pPr>
         <w:pStyle w:val="Heading2"/>
+        <w:keepNext/>
         <w:spacing w:after="100" w:before="200"/>
       </w:pPr>
       <w:r>
@@ -1690,6 +1815,9 @@
             </w:tcMar>
           </w:tcPr>
           <w:p>
+            <w:pPr>
+              <w:keepNext/>
+            </w:pPr>
             <w:r>
               <w:rPr>
                 <w:rFonts w:ascii="Arial" w:cs="Arial" w:eastAsia="Arial" w:hAnsi="Arial"/>
@@ -1720,6 +1848,9 @@
             </w:tcMar>
           </w:tcPr>
           <w:p>
+            <w:pPr>
+              <w:keepNext/>
+            </w:pPr>
             <w:r>
               <w:rPr>
                 <w:rFonts w:ascii="Arial" w:cs="Arial" w:eastAsia="Arial" w:hAnsi="Arial"/>
@@ -1750,6 +1881,9 @@
             </w:tcMar>
           </w:tcPr>
           <w:p>
+            <w:pPr>
+              <w:keepNext/>
+            </w:pPr>
             <w:r>
               <w:rPr>
                 <w:rFonts w:ascii="Arial" w:cs="Arial" w:eastAsia="Arial" w:hAnsi="Arial"/>
@@ -1780,6 +1914,9 @@
             </w:tcMar>
           </w:tcPr>
           <w:p>
+            <w:pPr>
+              <w:keepNext/>
+            </w:pPr>
             <w:r>
               <w:rPr>
                 <w:rFonts w:ascii="Arial" w:cs="Arial" w:eastAsia="Arial" w:hAnsi="Arial"/>
@@ -1810,6 +1947,9 @@
             </w:tcMar>
           </w:tcPr>
           <w:p>
+            <w:pPr>
+              <w:keepNext/>
+            </w:pPr>
             <w:r>
               <w:rPr>
                 <w:rFonts w:ascii="Arial" w:cs="Arial" w:eastAsia="Arial" w:hAnsi="Arial"/>
@@ -1844,6 +1984,9 @@
             </w:tcMar>
           </w:tcPr>
           <w:p>
+            <w:pPr>
+              <w:keepNext/>
+            </w:pPr>
             <w:r>
               <w:rPr>
                 <w:rFonts w:ascii="Arial" w:cs="Arial" w:eastAsia="Arial" w:hAnsi="Arial"/>
@@ -1873,6 +2016,9 @@
             </w:tcMar>
           </w:tcPr>
           <w:p>
+            <w:pPr>
+              <w:keepNext/>
+            </w:pPr>
             <w:r>
               <w:rPr>
                 <w:rFonts w:ascii="Arial" w:cs="Arial" w:eastAsia="Arial" w:hAnsi="Arial"/>
@@ -1902,6 +2048,9 @@
             </w:tcMar>
           </w:tcPr>
           <w:p>
+            <w:pPr>
+              <w:keepNext/>
+            </w:pPr>
             <w:r>
               <w:rPr>
                 <w:rFonts w:ascii="Arial" w:cs="Arial" w:eastAsia="Arial" w:hAnsi="Arial"/>
@@ -1931,6 +2080,9 @@
             </w:tcMar>
           </w:tcPr>
           <w:p>
+            <w:pPr>
+              <w:keepNext/>
+            </w:pPr>
             <w:r>
               <w:rPr>
                 <w:rFonts w:ascii="Arial" w:cs="Arial" w:eastAsia="Arial" w:hAnsi="Arial"/>
@@ -1960,6 +2112,9 @@
             </w:tcMar>
           </w:tcPr>
           <w:p>
+            <w:pPr>
+              <w:keepNext/>
+            </w:pPr>
             <w:r>
               <w:rPr>
                 <w:rFonts w:ascii="Arial" w:cs="Arial" w:eastAsia="Arial" w:hAnsi="Arial"/>
@@ -1994,6 +2149,9 @@
             </w:tcMar>
           </w:tcPr>
           <w:p>
+            <w:pPr>
+              <w:keepNext/>
+            </w:pPr>
             <w:r>
               <w:rPr>
                 <w:rFonts w:ascii="Arial" w:cs="Arial" w:eastAsia="Arial" w:hAnsi="Arial"/>
@@ -2023,6 +2181,9 @@
             </w:tcMar>
           </w:tcPr>
           <w:p>
+            <w:pPr>
+              <w:keepNext/>
+            </w:pPr>
             <w:r>
               <w:rPr>
                 <w:rFonts w:ascii="Arial" w:cs="Arial" w:eastAsia="Arial" w:hAnsi="Arial"/>
@@ -2052,6 +2213,9 @@
             </w:tcMar>
           </w:tcPr>
           <w:p>
+            <w:pPr>
+              <w:keepNext/>
+            </w:pPr>
             <w:r>
               <w:rPr>
                 <w:rFonts w:ascii="Arial" w:cs="Arial" w:eastAsia="Arial" w:hAnsi="Arial"/>
@@ -2081,6 +2245,9 @@
             </w:tcMar>
           </w:tcPr>
           <w:p>
+            <w:pPr>
+              <w:keepNext/>
+            </w:pPr>
             <w:r>
               <w:rPr>
                 <w:rFonts w:ascii="Arial" w:cs="Arial" w:eastAsia="Arial" w:hAnsi="Arial"/>
@@ -2110,6 +2277,9 @@
             </w:tcMar>
           </w:tcPr>
           <w:p>
+            <w:pPr>
+              <w:keepNext/>
+            </w:pPr>
             <w:r>
               <w:rPr>
                 <w:rFonts w:ascii="Arial" w:cs="Arial" w:eastAsia="Arial" w:hAnsi="Arial"/>
@@ -2144,6 +2314,9 @@
             </w:tcMar>
           </w:tcPr>
           <w:p>
+            <w:pPr>
+              <w:keepNext/>
+            </w:pPr>
             <w:r>
               <w:rPr>
                 <w:rFonts w:ascii="Arial" w:cs="Arial" w:eastAsia="Arial" w:hAnsi="Arial"/>
@@ -2173,6 +2346,9 @@
             </w:tcMar>
           </w:tcPr>
           <w:p>
+            <w:pPr>
+              <w:keepNext/>
+            </w:pPr>
             <w:r>
               <w:rPr>
                 <w:rFonts w:ascii="Arial" w:cs="Arial" w:eastAsia="Arial" w:hAnsi="Arial"/>
@@ -2202,6 +2378,9 @@
             </w:tcMar>
           </w:tcPr>
           <w:p>
+            <w:pPr>
+              <w:keepNext/>
+            </w:pPr>
             <w:r>
               <w:rPr>
                 <w:rFonts w:ascii="Arial" w:cs="Arial" w:eastAsia="Arial" w:hAnsi="Arial"/>
@@ -2231,6 +2410,9 @@
             </w:tcMar>
           </w:tcPr>
           <w:p>
+            <w:pPr>
+              <w:keepNext/>
+            </w:pPr>
             <w:r>
               <w:rPr>
                 <w:rFonts w:ascii="Arial" w:cs="Arial" w:eastAsia="Arial" w:hAnsi="Arial"/>
@@ -2260,6 +2442,9 @@
             </w:tcMar>
           </w:tcPr>
           <w:p>
+            <w:pPr>
+              <w:keepNext/>
+            </w:pPr>
             <w:r>
               <w:rPr>
                 <w:rFonts w:ascii="Arial" w:cs="Arial" w:eastAsia="Arial" w:hAnsi="Arial"/>
@@ -2294,6 +2479,9 @@
             </w:tcMar>
           </w:tcPr>
           <w:p>
+            <w:pPr>
+              <w:keepNext/>
+            </w:pPr>
             <w:r>
               <w:rPr>
                 <w:rFonts w:ascii="Arial" w:cs="Arial" w:eastAsia="Arial" w:hAnsi="Arial"/>
@@ -2323,6 +2511,9 @@
             </w:tcMar>
           </w:tcPr>
           <w:p>
+            <w:pPr>
+              <w:keepNext/>
+            </w:pPr>
             <w:r>
               <w:rPr>
                 <w:rFonts w:ascii="Arial" w:cs="Arial" w:eastAsia="Arial" w:hAnsi="Arial"/>
@@ -2352,6 +2543,9 @@
             </w:tcMar>
           </w:tcPr>
           <w:p>
+            <w:pPr>
+              <w:keepNext/>
+            </w:pPr>
             <w:r>
               <w:rPr>
                 <w:rFonts w:ascii="Arial" w:cs="Arial" w:eastAsia="Arial" w:hAnsi="Arial"/>
@@ -2381,6 +2575,9 @@
             </w:tcMar>
           </w:tcPr>
           <w:p>
+            <w:pPr>
+              <w:keepNext/>
+            </w:pPr>
             <w:r>
               <w:rPr>
                 <w:rFonts w:ascii="Arial" w:cs="Arial" w:eastAsia="Arial" w:hAnsi="Arial"/>
@@ -2410,6 +2607,9 @@
             </w:tcMar>
           </w:tcPr>
           <w:p>
+            <w:pPr>
+              <w:keepNext/>
+            </w:pPr>
             <w:r>
               <w:rPr>
                 <w:rFonts w:ascii="Arial" w:cs="Arial" w:eastAsia="Arial" w:hAnsi="Arial"/>
@@ -2444,6 +2644,9 @@
             </w:tcMar>
           </w:tcPr>
           <w:p>
+            <w:pPr>
+              <w:keepNext w:val="false"/>
+            </w:pPr>
             <w:r>
               <w:rPr>
                 <w:rFonts w:ascii="Arial" w:cs="Arial" w:eastAsia="Arial" w:hAnsi="Arial"/>
@@ -2473,6 +2676,9 @@
             </w:tcMar>
           </w:tcPr>
           <w:p>
+            <w:pPr>
+              <w:keepNext w:val="false"/>
+            </w:pPr>
             <w:r>
               <w:rPr>
                 <w:rFonts w:ascii="Arial" w:cs="Arial" w:eastAsia="Arial" w:hAnsi="Arial"/>
@@ -2502,6 +2708,9 @@
             </w:tcMar>
           </w:tcPr>
           <w:p>
+            <w:pPr>
+              <w:keepNext w:val="false"/>
+            </w:pPr>
             <w:r>
               <w:rPr>
                 <w:rFonts w:ascii="Arial" w:cs="Arial" w:eastAsia="Arial" w:hAnsi="Arial"/>
@@ -2531,6 +2740,9 @@
             </w:tcMar>
           </w:tcPr>
           <w:p>
+            <w:pPr>
+              <w:keepNext w:val="false"/>
+            </w:pPr>
             <w:r>
               <w:rPr>
                 <w:rFonts w:ascii="Arial" w:cs="Arial" w:eastAsia="Arial" w:hAnsi="Arial"/>
@@ -2560,6 +2772,9 @@
             </w:tcMar>
           </w:tcPr>
           <w:p>
+            <w:pPr>
+              <w:keepNext w:val="false"/>
+            </w:pPr>
             <w:r>
               <w:rPr>
                 <w:rFonts w:ascii="Arial" w:cs="Arial" w:eastAsia="Arial" w:hAnsi="Arial"/>
@@ -2596,6 +2811,7 @@
     <w:p>
       <w:pPr>
         <w:pStyle w:val="Heading2"/>
+        <w:keepNext/>
         <w:spacing w:after="100" w:before="200"/>
       </w:pPr>
       <w:r>
@@ -2663,6 +2879,9 @@
             </w:tcMar>
           </w:tcPr>
           <w:p>
+            <w:pPr>
+              <w:keepNext/>
+            </w:pPr>
             <w:r>
               <w:rPr>
                 <w:rFonts w:ascii="Arial" w:cs="Arial" w:eastAsia="Arial" w:hAnsi="Arial"/>
@@ -2693,6 +2912,9 @@
             </w:tcMar>
           </w:tcPr>
           <w:p>
+            <w:pPr>
+              <w:keepNext/>
+            </w:pPr>
             <w:r>
               <w:rPr>
                 <w:rFonts w:ascii="Arial" w:cs="Arial" w:eastAsia="Arial" w:hAnsi="Arial"/>
@@ -2723,6 +2945,9 @@
             </w:tcMar>
           </w:tcPr>
           <w:p>
+            <w:pPr>
+              <w:keepNext/>
+            </w:pPr>
             <w:r>
               <w:rPr>
                 <w:rFonts w:ascii="Arial" w:cs="Arial" w:eastAsia="Arial" w:hAnsi="Arial"/>
@@ -2757,6 +2982,9 @@
             </w:tcMar>
           </w:tcPr>
           <w:p>
+            <w:pPr>
+              <w:keepNext/>
+            </w:pPr>
             <w:r>
               <w:rPr>
                 <w:rFonts w:ascii="Arial" w:cs="Arial" w:eastAsia="Arial" w:hAnsi="Arial"/>
@@ -2786,6 +3014,9 @@
             </w:tcMar>
           </w:tcPr>
           <w:p>
+            <w:pPr>
+              <w:keepNext/>
+            </w:pPr>
             <w:r>
               <w:rPr>
                 <w:rFonts w:ascii="Arial" w:cs="Arial" w:eastAsia="Arial" w:hAnsi="Arial"/>
@@ -2815,6 +3046,9 @@
             </w:tcMar>
           </w:tcPr>
           <w:p>
+            <w:pPr>
+              <w:keepNext/>
+            </w:pPr>
             <w:r>
               <w:rPr>
                 <w:rFonts w:ascii="Arial" w:cs="Arial" w:eastAsia="Arial" w:hAnsi="Arial"/>
@@ -2849,6 +3083,9 @@
             </w:tcMar>
           </w:tcPr>
           <w:p>
+            <w:pPr>
+              <w:keepNext/>
+            </w:pPr>
             <w:r>
               <w:rPr>
                 <w:rFonts w:ascii="Arial" w:cs="Arial" w:eastAsia="Arial" w:hAnsi="Arial"/>
@@ -2878,6 +3115,9 @@
             </w:tcMar>
           </w:tcPr>
           <w:p>
+            <w:pPr>
+              <w:keepNext/>
+            </w:pPr>
             <w:r>
               <w:rPr>
                 <w:rFonts w:ascii="Arial" w:cs="Arial" w:eastAsia="Arial" w:hAnsi="Arial"/>
@@ -2907,6 +3147,9 @@
             </w:tcMar>
           </w:tcPr>
           <w:p>
+            <w:pPr>
+              <w:keepNext/>
+            </w:pPr>
             <w:r>
               <w:rPr>
                 <w:rFonts w:ascii="Arial" w:cs="Arial" w:eastAsia="Arial" w:hAnsi="Arial"/>
@@ -2941,6 +3184,9 @@
             </w:tcMar>
           </w:tcPr>
           <w:p>
+            <w:pPr>
+              <w:keepNext/>
+            </w:pPr>
             <w:r>
               <w:rPr>
                 <w:rFonts w:ascii="Arial" w:cs="Arial" w:eastAsia="Arial" w:hAnsi="Arial"/>
@@ -2970,6 +3216,9 @@
             </w:tcMar>
           </w:tcPr>
           <w:p>
+            <w:pPr>
+              <w:keepNext/>
+            </w:pPr>
             <w:r>
               <w:rPr>
                 <w:rFonts w:ascii="Arial" w:cs="Arial" w:eastAsia="Arial" w:hAnsi="Arial"/>
@@ -2999,6 +3248,9 @@
             </w:tcMar>
           </w:tcPr>
           <w:p>
+            <w:pPr>
+              <w:keepNext/>
+            </w:pPr>
             <w:r>
               <w:rPr>
                 <w:rFonts w:ascii="Arial" w:cs="Arial" w:eastAsia="Arial" w:hAnsi="Arial"/>
@@ -3033,6 +3285,9 @@
             </w:tcMar>
           </w:tcPr>
           <w:p>
+            <w:pPr>
+              <w:keepNext/>
+            </w:pPr>
             <w:r>
               <w:rPr>
                 <w:rFonts w:ascii="Arial" w:cs="Arial" w:eastAsia="Arial" w:hAnsi="Arial"/>
@@ -3062,6 +3317,9 @@
             </w:tcMar>
           </w:tcPr>
           <w:p>
+            <w:pPr>
+              <w:keepNext/>
+            </w:pPr>
             <w:r>
               <w:rPr>
                 <w:rFonts w:ascii="Arial" w:cs="Arial" w:eastAsia="Arial" w:hAnsi="Arial"/>
@@ -3091,6 +3349,9 @@
             </w:tcMar>
           </w:tcPr>
           <w:p>
+            <w:pPr>
+              <w:keepNext/>
+            </w:pPr>
             <w:r>
               <w:rPr>
                 <w:rFonts w:ascii="Arial" w:cs="Arial" w:eastAsia="Arial" w:hAnsi="Arial"/>
@@ -3125,6 +3386,9 @@
             </w:tcMar>
           </w:tcPr>
           <w:p>
+            <w:pPr>
+              <w:keepNext w:val="false"/>
+            </w:pPr>
             <w:r>
               <w:rPr>
                 <w:rFonts w:ascii="Arial" w:cs="Arial" w:eastAsia="Arial" w:hAnsi="Arial"/>
@@ -3154,6 +3418,9 @@
             </w:tcMar>
           </w:tcPr>
           <w:p>
+            <w:pPr>
+              <w:keepNext w:val="false"/>
+            </w:pPr>
             <w:r>
               <w:rPr>
                 <w:rFonts w:ascii="Arial" w:cs="Arial" w:eastAsia="Arial" w:hAnsi="Arial"/>
@@ -3183,6 +3450,9 @@
             </w:tcMar>
           </w:tcPr>
           <w:p>
+            <w:pPr>
+              <w:keepNext w:val="false"/>
+            </w:pPr>
             <w:r>
               <w:rPr>
                 <w:rFonts w:ascii="Arial" w:cs="Arial" w:eastAsia="Arial" w:hAnsi="Arial"/>
@@ -3238,6 +3508,7 @@
     <w:p>
       <w:pPr>
         <w:pStyle w:val="Heading1"/>
+        <w:keepNext/>
         <w:spacing w:after="160" w:before="320"/>
       </w:pPr>
       <w:r>
@@ -3255,6 +3526,7 @@
     <w:p>
       <w:pPr>
         <w:pStyle w:val="Heading2"/>
+        <w:keepNext/>
         <w:spacing w:after="100" w:before="200"/>
       </w:pPr>
       <w:r>
@@ -3398,6 +3670,7 @@
     <w:p>
       <w:pPr>
         <w:pStyle w:val="Heading2"/>
+        <w:keepNext/>
         <w:spacing w:after="100" w:before="200"/>
       </w:pPr>
       <w:r>
@@ -3487,6 +3760,7 @@
     <w:p>
       <w:pPr>
         <w:pStyle w:val="Heading2"/>
+        <w:keepNext/>
         <w:spacing w:after="100" w:before="200"/>
       </w:pPr>
       <w:r>
@@ -3590,6 +3864,7 @@
     <w:p>
       <w:pPr>
         <w:pStyle w:val="Heading2"/>
+        <w:keepNext/>
         <w:spacing w:after="100" w:before="200"/>
       </w:pPr>
       <w:r>
@@ -3626,6 +3901,7 @@
     <w:p>
       <w:pPr>
         <w:pStyle w:val="Heading1"/>
+        <w:keepNext/>
         <w:spacing w:after="160" w:before="320"/>
       </w:pPr>
       <w:r>
@@ -3879,6 +4155,7 @@
     <w:p>
       <w:pPr>
         <w:pStyle w:val="Heading1"/>
+        <w:keepNext/>
         <w:spacing w:after="160" w:before="320"/>
       </w:pPr>
       <w:r>
@@ -3896,6 +4173,7 @@
     <w:p>
       <w:pPr>
         <w:pStyle w:val="Heading2"/>
+        <w:keepNext/>
         <w:spacing w:after="100" w:before="200"/>
       </w:pPr>
       <w:r>
@@ -3951,6 +4229,9 @@
             </w:tcMar>
           </w:tcPr>
           <w:p>
+            <w:pPr>
+              <w:keepNext/>
+            </w:pPr>
             <w:r>
               <w:rPr>
                 <w:rFonts w:ascii="Arial" w:cs="Arial" w:eastAsia="Arial" w:hAnsi="Arial"/>
@@ -3981,6 +4262,9 @@
             </w:tcMar>
           </w:tcPr>
           <w:p>
+            <w:pPr>
+              <w:keepNext/>
+            </w:pPr>
             <w:r>
               <w:rPr>
                 <w:rFonts w:ascii="Arial" w:cs="Arial" w:eastAsia="Arial" w:hAnsi="Arial"/>
@@ -4011,6 +4295,9 @@
             </w:tcMar>
           </w:tcPr>
           <w:p>
+            <w:pPr>
+              <w:keepNext/>
+            </w:pPr>
             <w:r>
               <w:rPr>
                 <w:rFonts w:ascii="Arial" w:cs="Arial" w:eastAsia="Arial" w:hAnsi="Arial"/>
@@ -4041,6 +4328,9 @@
             </w:tcMar>
           </w:tcPr>
           <w:p>
+            <w:pPr>
+              <w:keepNext/>
+            </w:pPr>
             <w:r>
               <w:rPr>
                 <w:rFonts w:ascii="Arial" w:cs="Arial" w:eastAsia="Arial" w:hAnsi="Arial"/>
@@ -4071,6 +4361,9 @@
             </w:tcMar>
           </w:tcPr>
           <w:p>
+            <w:pPr>
+              <w:keepNext/>
+            </w:pPr>
             <w:r>
               <w:rPr>
                 <w:rFonts w:ascii="Arial" w:cs="Arial" w:eastAsia="Arial" w:hAnsi="Arial"/>
@@ -4105,6 +4398,9 @@
             </w:tcMar>
           </w:tcPr>
           <w:p>
+            <w:pPr>
+              <w:keepNext/>
+            </w:pPr>
             <w:r>
               <w:rPr>
                 <w:rFonts w:ascii="Arial" w:cs="Arial" w:eastAsia="Arial" w:hAnsi="Arial"/>
@@ -4134,6 +4430,9 @@
             </w:tcMar>
           </w:tcPr>
           <w:p>
+            <w:pPr>
+              <w:keepNext/>
+            </w:pPr>
             <w:r>
               <w:rPr>
                 <w:rFonts w:ascii="Arial" w:cs="Arial" w:eastAsia="Arial" w:hAnsi="Arial"/>
@@ -4163,6 +4462,9 @@
             </w:tcMar>
           </w:tcPr>
           <w:p>
+            <w:pPr>
+              <w:keepNext/>
+            </w:pPr>
             <w:r>
               <w:rPr>
                 <w:rFonts w:ascii="Arial" w:cs="Arial" w:eastAsia="Arial" w:hAnsi="Arial"/>
@@ -4192,6 +4494,9 @@
             </w:tcMar>
           </w:tcPr>
           <w:p>
+            <w:pPr>
+              <w:keepNext/>
+            </w:pPr>
             <w:r>
               <w:rPr>
                 <w:rFonts w:ascii="Arial" w:cs="Arial" w:eastAsia="Arial" w:hAnsi="Arial"/>
@@ -4221,6 +4526,9 @@
             </w:tcMar>
           </w:tcPr>
           <w:p>
+            <w:pPr>
+              <w:keepNext/>
+            </w:pPr>
             <w:r>
               <w:rPr>
                 <w:rFonts w:ascii="Arial" w:cs="Arial" w:eastAsia="Arial" w:hAnsi="Arial"/>
@@ -4255,6 +4563,9 @@
             </w:tcMar>
           </w:tcPr>
           <w:p>
+            <w:pPr>
+              <w:keepNext/>
+            </w:pPr>
             <w:r>
               <w:rPr>
                 <w:rFonts w:ascii="Arial" w:cs="Arial" w:eastAsia="Arial" w:hAnsi="Arial"/>
@@ -4284,6 +4595,9 @@
             </w:tcMar>
           </w:tcPr>
           <w:p>
+            <w:pPr>
+              <w:keepNext/>
+            </w:pPr>
             <w:r>
               <w:rPr>
                 <w:rFonts w:ascii="Arial" w:cs="Arial" w:eastAsia="Arial" w:hAnsi="Arial"/>
@@ -4313,6 +4627,9 @@
             </w:tcMar>
           </w:tcPr>
           <w:p>
+            <w:pPr>
+              <w:keepNext/>
+            </w:pPr>
             <w:r>
               <w:rPr>
                 <w:rFonts w:ascii="Arial" w:cs="Arial" w:eastAsia="Arial" w:hAnsi="Arial"/>
@@ -4342,6 +4659,9 @@
             </w:tcMar>
           </w:tcPr>
           <w:p>
+            <w:pPr>
+              <w:keepNext/>
+            </w:pPr>
             <w:r>
               <w:rPr>
                 <w:rFonts w:ascii="Arial" w:cs="Arial" w:eastAsia="Arial" w:hAnsi="Arial"/>
@@ -4371,6 +4691,9 @@
             </w:tcMar>
           </w:tcPr>
           <w:p>
+            <w:pPr>
+              <w:keepNext/>
+            </w:pPr>
             <w:r>
               <w:rPr>
                 <w:rFonts w:ascii="Arial" w:cs="Arial" w:eastAsia="Arial" w:hAnsi="Arial"/>
@@ -4405,6 +4728,9 @@
             </w:tcMar>
           </w:tcPr>
           <w:p>
+            <w:pPr>
+              <w:keepNext w:val="false"/>
+            </w:pPr>
             <w:r>
               <w:rPr>
                 <w:rFonts w:ascii="Arial" w:cs="Arial" w:eastAsia="Arial" w:hAnsi="Arial"/>
@@ -4434,6 +4760,9 @@
             </w:tcMar>
           </w:tcPr>
           <w:p>
+            <w:pPr>
+              <w:keepNext w:val="false"/>
+            </w:pPr>
             <w:r>
               <w:rPr>
                 <w:rFonts w:ascii="Arial" w:cs="Arial" w:eastAsia="Arial" w:hAnsi="Arial"/>
@@ -4463,6 +4792,9 @@
             </w:tcMar>
           </w:tcPr>
           <w:p>
+            <w:pPr>
+              <w:keepNext w:val="false"/>
+            </w:pPr>
             <w:r>
               <w:rPr>
                 <w:rFonts w:ascii="Arial" w:cs="Arial" w:eastAsia="Arial" w:hAnsi="Arial"/>
@@ -4492,6 +4824,9 @@
             </w:tcMar>
           </w:tcPr>
           <w:p>
+            <w:pPr>
+              <w:keepNext w:val="false"/>
+            </w:pPr>
             <w:r>
               <w:rPr>
                 <w:rFonts w:ascii="Arial" w:cs="Arial" w:eastAsia="Arial" w:hAnsi="Arial"/>
@@ -4521,6 +4856,9 @@
             </w:tcMar>
           </w:tcPr>
           <w:p>
+            <w:pPr>
+              <w:keepNext w:val="false"/>
+            </w:pPr>
             <w:r>
               <w:rPr>
                 <w:rFonts w:ascii="Arial" w:cs="Arial" w:eastAsia="Arial" w:hAnsi="Arial"/>
@@ -4620,6 +4958,7 @@
     <w:p>
       <w:pPr>
         <w:pStyle w:val="Heading2"/>
+        <w:keepNext/>
         <w:spacing w:after="100" w:before="200"/>
       </w:pPr>
       <w:r>
@@ -4764,6 +5103,9 @@
             </w:tcMar>
           </w:tcPr>
           <w:p>
+            <w:pPr>
+              <w:keepNext/>
+            </w:pPr>
             <w:r>
               <w:rPr>
                 <w:rFonts w:ascii="Arial" w:cs="Arial" w:eastAsia="Arial" w:hAnsi="Arial"/>
@@ -4794,6 +5136,9 @@
             </w:tcMar>
           </w:tcPr>
           <w:p>
+            <w:pPr>
+              <w:keepNext/>
+            </w:pPr>
             <w:r>
               <w:rPr>
                 <w:rFonts w:ascii="Arial" w:cs="Arial" w:eastAsia="Arial" w:hAnsi="Arial"/>
@@ -4824,6 +5169,9 @@
             </w:tcMar>
           </w:tcPr>
           <w:p>
+            <w:pPr>
+              <w:keepNext/>
+            </w:pPr>
             <w:r>
               <w:rPr>
                 <w:rFonts w:ascii="Arial" w:cs="Arial" w:eastAsia="Arial" w:hAnsi="Arial"/>
@@ -4858,6 +5206,9 @@
             </w:tcMar>
           </w:tcPr>
           <w:p>
+            <w:pPr>
+              <w:keepNext/>
+            </w:pPr>
             <w:r>
               <w:rPr>
                 <w:rFonts w:ascii="Arial" w:cs="Arial" w:eastAsia="Arial" w:hAnsi="Arial"/>
@@ -4887,6 +5238,9 @@
             </w:tcMar>
           </w:tcPr>
           <w:p>
+            <w:pPr>
+              <w:keepNext/>
+            </w:pPr>
             <w:r>
               <w:rPr>
                 <w:rFonts w:ascii="Arial" w:cs="Arial" w:eastAsia="Arial" w:hAnsi="Arial"/>
@@ -4916,6 +5270,9 @@
             </w:tcMar>
           </w:tcPr>
           <w:p>
+            <w:pPr>
+              <w:keepNext/>
+            </w:pPr>
             <w:r>
               <w:rPr>
                 <w:rFonts w:ascii="Arial" w:cs="Arial" w:eastAsia="Arial" w:hAnsi="Arial"/>
@@ -4950,6 +5307,9 @@
             </w:tcMar>
           </w:tcPr>
           <w:p>
+            <w:pPr>
+              <w:keepNext/>
+            </w:pPr>
             <w:r>
               <w:rPr>
                 <w:rFonts w:ascii="Arial" w:cs="Arial" w:eastAsia="Arial" w:hAnsi="Arial"/>
@@ -4979,6 +5339,9 @@
             </w:tcMar>
           </w:tcPr>
           <w:p>
+            <w:pPr>
+              <w:keepNext/>
+            </w:pPr>
             <w:r>
               <w:rPr>
                 <w:rFonts w:ascii="Arial" w:cs="Arial" w:eastAsia="Arial" w:hAnsi="Arial"/>
@@ -5008,6 +5371,9 @@
             </w:tcMar>
           </w:tcPr>
           <w:p>
+            <w:pPr>
+              <w:keepNext/>
+            </w:pPr>
             <w:r>
               <w:rPr>
                 <w:rFonts w:ascii="Arial" w:cs="Arial" w:eastAsia="Arial" w:hAnsi="Arial"/>
@@ -5042,6 +5408,9 @@
             </w:tcMar>
           </w:tcPr>
           <w:p>
+            <w:pPr>
+              <w:keepNext w:val="false"/>
+            </w:pPr>
             <w:r>
               <w:rPr>
                 <w:rFonts w:ascii="Arial" w:cs="Arial" w:eastAsia="Arial" w:hAnsi="Arial"/>
@@ -5071,6 +5440,9 @@
             </w:tcMar>
           </w:tcPr>
           <w:p>
+            <w:pPr>
+              <w:keepNext w:val="false"/>
+            </w:pPr>
             <w:r>
               <w:rPr>
                 <w:rFonts w:ascii="Arial" w:cs="Arial" w:eastAsia="Arial" w:hAnsi="Arial"/>
@@ -5100,6 +5472,9 @@
             </w:tcMar>
           </w:tcPr>
           <w:p>
+            <w:pPr>
+              <w:keepNext w:val="false"/>
+            </w:pPr>
             <w:r>
               <w:rPr>
                 <w:rFonts w:ascii="Arial" w:cs="Arial" w:eastAsia="Arial" w:hAnsi="Arial"/>
@@ -5136,6 +5511,7 @@
     <w:p>
       <w:pPr>
         <w:pStyle w:val="Heading1"/>
+        <w:keepNext/>
         <w:spacing w:after="160" w:before="320"/>
       </w:pPr>
       <w:r>
@@ -5161,12 +5537,13 @@
           <w:sz w:val="21"/>
           <w:szCs w:val="21"/>
         </w:rPr>
-        <w:t xml:space="preserve">The brief names BG/NBD (Lifetimes library) as the main CLV method. As explained in Section 2.3, the 500-row file cannot support it, because BG/NBD needs each customer’s purchase history. Following the Dataset Generation Prompt, a transaction-level dataset was therefore generated: 5,000 customers and 30,318 transactions over three years (27 October 2023 to 26 October 2026), saved as transactions.csv with timestamps in YYYY-MM-DD HH:MM:SS format.</w:t>
+        <w:t xml:space="preserve">The brief names BG/NBD (Lifetimes library) as the main CLV method. As explained in Section 2.3, the 500-row file cannot support it, because BG/NBD needs each customer’s purchase history. Following the Dataset Generation Prompt, a transaction-level dataset was therefore generated: 5,000 customers and 31,256 transactions over three years (27 October 2023 to 26 October 2026), saved as transactions.csv with timestamps in YYYY-MM-DD HH:MM:SS format. About 3% of the rows (938) are labelled anomalies, as the Dataset Generation Prompt asks.</w:t>
       </w:r>
     </w:p>
     <w:p>
       <w:pPr>
         <w:pStyle w:val="Heading2"/>
+        <w:keepNext/>
         <w:spacing w:after="100" w:before="200"/>
       </w:pPr>
       <w:r>
@@ -5192,12 +5569,13 @@
           <w:sz w:val="21"/>
           <w:szCs w:val="21"/>
         </w:rPr>
-        <w:t xml:space="preserve">The data were simulated with a script (clv_bgnbd.py, fixed random seed), not collected from real customers. Each customer has a purchase rate (gamma-distributed), a probability of becoming inactive after each purchase (beta-distributed) and a spending level (gamma-gamma structure), and customers join at different dates over the first two years. Orders average 1,481 and customers make 6.1 purchases on average (median 3). Because the data come from the same family of models that is then fitted, a good fit is expected. What this part of the project shows is that the pipeline is implemented and validated correctly, and that it recovers known parameters; it does not show how well BG/NBD would describe a real retailer.</w:t>
+        <w:t xml:space="preserve">The data were simulated with a script (clv_bgnbd.py, fixed random seed), not collected from real customers. Each customer has a purchase rate (gamma-distributed), a probability of becoming inactive after each purchase (beta-distributed) and a spending level (gamma-gamma structure), and customers join at different dates over the first two years. After the anomalies are removed (next section), orders average 1,466 and customers make 6.1 purchases on average (median 3). Because the data come from the same family of models that is then fitted, a good fit is expected. What this part of the project shows is that the pipeline is implemented and validated correctly, and that it recovers known parameters; it does not show how well BG/NBD would describe a real retailer.</w:t>
       </w:r>
     </w:p>
     <w:p>
       <w:pPr>
         <w:pStyle w:val="Heading2"/>
+        <w:keepNext/>
         <w:spacing w:after="100" w:before="200"/>
       </w:pPr>
       <w:r>
@@ -5209,7 +5587,685 @@
           <w:sz w:val="24"/>
           <w:szCs w:val="24"/>
         </w:rPr>
-        <w:t xml:space="preserve">6.2 Method</w:t>
+        <w:t xml:space="preserve">6.2 Anomalies: labelling, detection and removal</w:t>
+      </w:r>
+    </w:p>
+    <w:p>
+      <w:pPr>
+        <w:spacing w:after="140" w:line="300"/>
+        <w:jc w:val="both"/>
+      </w:pPr>
+      <w:r>
+        <w:rPr>
+          <w:rFonts w:ascii="Arial" w:cs="Arial" w:eastAsia="Arial" w:hAnsi="Arial"/>
+          <w:sz w:val="21"/>
+          <w:szCs w:val="21"/>
+        </w:rPr>
+        <w:t xml:space="preserve">The prompt asks for anomalies at roughly 2–5% of rows. 938 anomalous transactions (3.0% of 31,256 rows) were added: 70% were very large orders (8 to 15 times the average, like bulk or fraudulent orders) and 30% were near-zero orders (like test orders or refunds). The is_anomaly column holds this ground-truth label, which exists only because the data are simulated. Detection does not use the labels. A transaction is flagged if it is near zero (under 10), if it is more than 5 times the customer’s own median order (for customers with 3 or more orders), or if it is above a global Tukey fence (third quartile plus 7 times the interquartile range).</w:t>
+      </w:r>
+    </w:p>
+    <w:tbl>
+      <w:tblPr>
+        <w:tblW w:type="dxa" w:w="9000"/>
+        <w:tblBorders>
+          <w:top w:val="single" w:color="auto" w:sz="4"/>
+          <w:left w:val="single" w:color="auto" w:sz="4"/>
+          <w:bottom w:val="single" w:color="auto" w:sz="4"/>
+          <w:right w:val="single" w:color="auto" w:sz="4"/>
+          <w:insideH w:val="single" w:color="auto" w:sz="4"/>
+          <w:insideV w:val="single" w:color="auto" w:sz="4"/>
+        </w:tblBorders>
+      </w:tblPr>
+      <w:tblGrid>
+        <w:gridCol w:w="4200"/>
+        <w:gridCol w:w="2400"/>
+        <w:gridCol w:w="2400"/>
+      </w:tblGrid>
+      <w:tr>
+        <w:trPr>
+          <w:tblHeader/>
+        </w:trPr>
+        <w:tc>
+          <w:tcPr>
+            <w:tcW w:type="dxa" w:w="4200"/>
+            <w:tcBorders>
+              <w:top w:val="single" w:color="BBBBBB" w:sz="4"/>
+              <w:left w:val="single" w:color="BBBBBB" w:sz="4"/>
+              <w:bottom w:val="single" w:color="BBBBBB" w:sz="4"/>
+              <w:right w:val="single" w:color="BBBBBB" w:sz="4"/>
+            </w:tcBorders>
+            <w:shd w:fill="D9C3F0" w:color="auto" w:val="clear"/>
+            <w:tcMar>
+              <w:top w:type="dxa" w:w="60"/>
+              <w:left w:type="dxa" w:w="100"/>
+              <w:bottom w:type="dxa" w:w="60"/>
+              <w:right w:type="dxa" w:w="100"/>
+            </w:tcMar>
+          </w:tcPr>
+          <w:p>
+            <w:pPr>
+              <w:keepNext/>
+            </w:pPr>
+            <w:r>
+              <w:rPr>
+                <w:rFonts w:ascii="Arial" w:cs="Arial" w:eastAsia="Arial" w:hAnsi="Arial"/>
+                <w:b/>
+                <w:bCs/>
+                <w:sz w:val="19"/>
+                <w:szCs w:val="19"/>
+              </w:rPr>
+              <w:t xml:space="preserve">Detection result</w:t>
+            </w:r>
+          </w:p>
+        </w:tc>
+        <w:tc>
+          <w:tcPr>
+            <w:tcW w:type="dxa" w:w="2400"/>
+            <w:tcBorders>
+              <w:top w:val="single" w:color="BBBBBB" w:sz="4"/>
+              <w:left w:val="single" w:color="BBBBBB" w:sz="4"/>
+              <w:bottom w:val="single" w:color="BBBBBB" w:sz="4"/>
+              <w:right w:val="single" w:color="BBBBBB" w:sz="4"/>
+            </w:tcBorders>
+            <w:shd w:fill="D9C3F0" w:color="auto" w:val="clear"/>
+            <w:tcMar>
+              <w:top w:type="dxa" w:w="60"/>
+              <w:left w:type="dxa" w:w="100"/>
+              <w:bottom w:type="dxa" w:w="60"/>
+              <w:right w:type="dxa" w:w="100"/>
+            </w:tcMar>
+          </w:tcPr>
+          <w:p>
+            <w:pPr>
+              <w:keepNext/>
+            </w:pPr>
+            <w:r>
+              <w:rPr>
+                <w:rFonts w:ascii="Arial" w:cs="Arial" w:eastAsia="Arial" w:hAnsi="Arial"/>
+                <w:b/>
+                <w:bCs/>
+                <w:sz w:val="19"/>
+                <w:szCs w:val="19"/>
+              </w:rPr>
+              <w:t xml:space="preserve">Value</w:t>
+            </w:r>
+          </w:p>
+        </w:tc>
+        <w:tc>
+          <w:tcPr>
+            <w:tcW w:type="dxa" w:w="2400"/>
+            <w:tcBorders>
+              <w:top w:val="single" w:color="BBBBBB" w:sz="4"/>
+              <w:left w:val="single" w:color="BBBBBB" w:sz="4"/>
+              <w:bottom w:val="single" w:color="BBBBBB" w:sz="4"/>
+              <w:right w:val="single" w:color="BBBBBB" w:sz="4"/>
+            </w:tcBorders>
+            <w:shd w:fill="D9C3F0" w:color="auto" w:val="clear"/>
+            <w:tcMar>
+              <w:top w:type="dxa" w:w="60"/>
+              <w:left w:type="dxa" w:w="100"/>
+              <w:bottom w:type="dxa" w:w="60"/>
+              <w:right w:type="dxa" w:w="100"/>
+            </w:tcMar>
+          </w:tcPr>
+          <w:p>
+            <w:pPr>
+              <w:keepNext/>
+            </w:pPr>
+            <w:r>
+              <w:rPr>
+                <w:rFonts w:ascii="Arial" w:cs="Arial" w:eastAsia="Arial" w:hAnsi="Arial"/>
+                <w:b/>
+                <w:bCs/>
+                <w:sz w:val="19"/>
+                <w:szCs w:val="19"/>
+              </w:rPr>
+              <w:t xml:space="preserve">Note</w:t>
+            </w:r>
+          </w:p>
+        </w:tc>
+      </w:tr>
+      <w:tr>
+        <w:trPr>
+          <w:tblHeader w:val="off"/>
+        </w:trPr>
+        <w:tc>
+          <w:tcPr>
+            <w:tcW w:type="dxa" w:w="4200"/>
+            <w:tcBorders>
+              <w:top w:val="single" w:color="BBBBBB" w:sz="4"/>
+              <w:left w:val="single" w:color="BBBBBB" w:sz="4"/>
+              <w:bottom w:val="single" w:color="BBBBBB" w:sz="4"/>
+              <w:right w:val="single" w:color="BBBBBB" w:sz="4"/>
+            </w:tcBorders>
+            <w:tcMar>
+              <w:top w:type="dxa" w:w="60"/>
+              <w:left w:type="dxa" w:w="100"/>
+              <w:bottom w:type="dxa" w:w="60"/>
+              <w:right w:type="dxa" w:w="100"/>
+            </w:tcMar>
+          </w:tcPr>
+          <w:p>
+            <w:pPr>
+              <w:keepNext/>
+            </w:pPr>
+            <w:r>
+              <w:rPr>
+                <w:rFonts w:ascii="Arial" w:cs="Arial" w:eastAsia="Arial" w:hAnsi="Arial"/>
+                <w:b w:val="false"/>
+                <w:bCs w:val="false"/>
+                <w:sz w:val="19"/>
+                <w:szCs w:val="19"/>
+              </w:rPr>
+              <w:t xml:space="preserve">Anomalies injected</w:t>
+            </w:r>
+          </w:p>
+        </w:tc>
+        <w:tc>
+          <w:tcPr>
+            <w:tcW w:type="dxa" w:w="2400"/>
+            <w:tcBorders>
+              <w:top w:val="single" w:color="BBBBBB" w:sz="4"/>
+              <w:left w:val="single" w:color="BBBBBB" w:sz="4"/>
+              <w:bottom w:val="single" w:color="BBBBBB" w:sz="4"/>
+              <w:right w:val="single" w:color="BBBBBB" w:sz="4"/>
+            </w:tcBorders>
+            <w:tcMar>
+              <w:top w:type="dxa" w:w="60"/>
+              <w:left w:type="dxa" w:w="100"/>
+              <w:bottom w:type="dxa" w:w="60"/>
+              <w:right w:type="dxa" w:w="100"/>
+            </w:tcMar>
+          </w:tcPr>
+          <w:p>
+            <w:pPr>
+              <w:keepNext/>
+            </w:pPr>
+            <w:r>
+              <w:rPr>
+                <w:rFonts w:ascii="Arial" w:cs="Arial" w:eastAsia="Arial" w:hAnsi="Arial"/>
+                <w:b w:val="false"/>
+                <w:bCs w:val="false"/>
+                <w:sz w:val="19"/>
+                <w:szCs w:val="19"/>
+              </w:rPr>
+              <w:t xml:space="preserve">938</w:t>
+            </w:r>
+          </w:p>
+        </w:tc>
+        <w:tc>
+          <w:tcPr>
+            <w:tcW w:type="dxa" w:w="2400"/>
+            <w:tcBorders>
+              <w:top w:val="single" w:color="BBBBBB" w:sz="4"/>
+              <w:left w:val="single" w:color="BBBBBB" w:sz="4"/>
+              <w:bottom w:val="single" w:color="BBBBBB" w:sz="4"/>
+              <w:right w:val="single" w:color="BBBBBB" w:sz="4"/>
+            </w:tcBorders>
+            <w:tcMar>
+              <w:top w:type="dxa" w:w="60"/>
+              <w:left w:type="dxa" w:w="100"/>
+              <w:bottom w:type="dxa" w:w="60"/>
+              <w:right w:type="dxa" w:w="100"/>
+            </w:tcMar>
+          </w:tcPr>
+          <w:p>
+            <w:pPr>
+              <w:keepNext/>
+            </w:pPr>
+            <w:r>
+              <w:rPr>
+                <w:rFonts w:ascii="Arial" w:cs="Arial" w:eastAsia="Arial" w:hAnsi="Arial"/>
+                <w:b w:val="false"/>
+                <w:bCs w:val="false"/>
+                <w:sz w:val="19"/>
+                <w:szCs w:val="19"/>
+              </w:rPr>
+              <w:t xml:space="preserve">3.0% of rows</w:t>
+            </w:r>
+          </w:p>
+        </w:tc>
+      </w:tr>
+      <w:tr>
+        <w:trPr>
+          <w:tblHeader w:val="off"/>
+        </w:trPr>
+        <w:tc>
+          <w:tcPr>
+            <w:tcW w:type="dxa" w:w="4200"/>
+            <w:tcBorders>
+              <w:top w:val="single" w:color="BBBBBB" w:sz="4"/>
+              <w:left w:val="single" w:color="BBBBBB" w:sz="4"/>
+              <w:bottom w:val="single" w:color="BBBBBB" w:sz="4"/>
+              <w:right w:val="single" w:color="BBBBBB" w:sz="4"/>
+            </w:tcBorders>
+            <w:tcMar>
+              <w:top w:type="dxa" w:w="60"/>
+              <w:left w:type="dxa" w:w="100"/>
+              <w:bottom w:type="dxa" w:w="60"/>
+              <w:right w:type="dxa" w:w="100"/>
+            </w:tcMar>
+          </w:tcPr>
+          <w:p>
+            <w:pPr>
+              <w:keepNext/>
+            </w:pPr>
+            <w:r>
+              <w:rPr>
+                <w:rFonts w:ascii="Arial" w:cs="Arial" w:eastAsia="Arial" w:hAnsi="Arial"/>
+                <w:b w:val="false"/>
+                <w:bCs w:val="false"/>
+                <w:sz w:val="19"/>
+                <w:szCs w:val="19"/>
+              </w:rPr>
+              <w:t xml:space="preserve">Rows flagged</w:t>
+            </w:r>
+          </w:p>
+        </w:tc>
+        <w:tc>
+          <w:tcPr>
+            <w:tcW w:type="dxa" w:w="2400"/>
+            <w:tcBorders>
+              <w:top w:val="single" w:color="BBBBBB" w:sz="4"/>
+              <w:left w:val="single" w:color="BBBBBB" w:sz="4"/>
+              <w:bottom w:val="single" w:color="BBBBBB" w:sz="4"/>
+              <w:right w:val="single" w:color="BBBBBB" w:sz="4"/>
+            </w:tcBorders>
+            <w:tcMar>
+              <w:top w:type="dxa" w:w="60"/>
+              <w:left w:type="dxa" w:w="100"/>
+              <w:bottom w:type="dxa" w:w="60"/>
+              <w:right w:type="dxa" w:w="100"/>
+            </w:tcMar>
+          </w:tcPr>
+          <w:p>
+            <w:pPr>
+              <w:keepNext/>
+            </w:pPr>
+            <w:r>
+              <w:rPr>
+                <w:rFonts w:ascii="Arial" w:cs="Arial" w:eastAsia="Arial" w:hAnsi="Arial"/>
+                <w:b w:val="false"/>
+                <w:bCs w:val="false"/>
+                <w:sz w:val="19"/>
+                <w:szCs w:val="19"/>
+              </w:rPr>
+              <w:t xml:space="preserve">984</w:t>
+            </w:r>
+          </w:p>
+        </w:tc>
+        <w:tc>
+          <w:tcPr>
+            <w:tcW w:type="dxa" w:w="2400"/>
+            <w:tcBorders>
+              <w:top w:val="single" w:color="BBBBBB" w:sz="4"/>
+              <w:left w:val="single" w:color="BBBBBB" w:sz="4"/>
+              <w:bottom w:val="single" w:color="BBBBBB" w:sz="4"/>
+              <w:right w:val="single" w:color="BBBBBB" w:sz="4"/>
+            </w:tcBorders>
+            <w:tcMar>
+              <w:top w:type="dxa" w:w="60"/>
+              <w:left w:type="dxa" w:w="100"/>
+              <w:bottom w:type="dxa" w:w="60"/>
+              <w:right w:type="dxa" w:w="100"/>
+            </w:tcMar>
+          </w:tcPr>
+          <w:p>
+            <w:pPr>
+              <w:keepNext/>
+            </w:pPr>
+            <w:r>
+              <w:rPr>
+                <w:rFonts w:ascii="Arial" w:cs="Arial" w:eastAsia="Arial" w:hAnsi="Arial"/>
+                <w:b w:val="false"/>
+                <w:bCs w:val="false"/>
+                <w:sz w:val="19"/>
+                <w:szCs w:val="19"/>
+              </w:rPr>
+              <w:t xml:space="preserve">anomaly_detected column</w:t>
+            </w:r>
+          </w:p>
+        </w:tc>
+      </w:tr>
+      <w:tr>
+        <w:trPr>
+          <w:tblHeader w:val="off"/>
+        </w:trPr>
+        <w:tc>
+          <w:tcPr>
+            <w:tcW w:type="dxa" w:w="4200"/>
+            <w:tcBorders>
+              <w:top w:val="single" w:color="BBBBBB" w:sz="4"/>
+              <w:left w:val="single" w:color="BBBBBB" w:sz="4"/>
+              <w:bottom w:val="single" w:color="BBBBBB" w:sz="4"/>
+              <w:right w:val="single" w:color="BBBBBB" w:sz="4"/>
+            </w:tcBorders>
+            <w:tcMar>
+              <w:top w:type="dxa" w:w="60"/>
+              <w:left w:type="dxa" w:w="100"/>
+              <w:bottom w:type="dxa" w:w="60"/>
+              <w:right w:type="dxa" w:w="100"/>
+            </w:tcMar>
+          </w:tcPr>
+          <w:p>
+            <w:pPr>
+              <w:keepNext/>
+            </w:pPr>
+            <w:r>
+              <w:rPr>
+                <w:rFonts w:ascii="Arial" w:cs="Arial" w:eastAsia="Arial" w:hAnsi="Arial"/>
+                <w:b w:val="false"/>
+                <w:bCs w:val="false"/>
+                <w:sz w:val="19"/>
+                <w:szCs w:val="19"/>
+              </w:rPr>
+              <w:t xml:space="preserve">Recall</w:t>
+            </w:r>
+          </w:p>
+        </w:tc>
+        <w:tc>
+          <w:tcPr>
+            <w:tcW w:type="dxa" w:w="2400"/>
+            <w:tcBorders>
+              <w:top w:val="single" w:color="BBBBBB" w:sz="4"/>
+              <w:left w:val="single" w:color="BBBBBB" w:sz="4"/>
+              <w:bottom w:val="single" w:color="BBBBBB" w:sz="4"/>
+              <w:right w:val="single" w:color="BBBBBB" w:sz="4"/>
+            </w:tcBorders>
+            <w:tcMar>
+              <w:top w:type="dxa" w:w="60"/>
+              <w:left w:type="dxa" w:w="100"/>
+              <w:bottom w:type="dxa" w:w="60"/>
+              <w:right w:type="dxa" w:w="100"/>
+            </w:tcMar>
+          </w:tcPr>
+          <w:p>
+            <w:pPr>
+              <w:keepNext/>
+            </w:pPr>
+            <w:r>
+              <w:rPr>
+                <w:rFonts w:ascii="Arial" w:cs="Arial" w:eastAsia="Arial" w:hAnsi="Arial"/>
+                <w:b w:val="false"/>
+                <w:bCs w:val="false"/>
+                <w:sz w:val="19"/>
+                <w:szCs w:val="19"/>
+              </w:rPr>
+              <w:t xml:space="preserve">1.000</w:t>
+            </w:r>
+          </w:p>
+        </w:tc>
+        <w:tc>
+          <w:tcPr>
+            <w:tcW w:type="dxa" w:w="2400"/>
+            <w:tcBorders>
+              <w:top w:val="single" w:color="BBBBBB" w:sz="4"/>
+              <w:left w:val="single" w:color="BBBBBB" w:sz="4"/>
+              <w:bottom w:val="single" w:color="BBBBBB" w:sz="4"/>
+              <w:right w:val="single" w:color="BBBBBB" w:sz="4"/>
+            </w:tcBorders>
+            <w:tcMar>
+              <w:top w:type="dxa" w:w="60"/>
+              <w:left w:type="dxa" w:w="100"/>
+              <w:bottom w:type="dxa" w:w="60"/>
+              <w:right w:type="dxa" w:w="100"/>
+            </w:tcMar>
+          </w:tcPr>
+          <w:p>
+            <w:pPr>
+              <w:keepNext/>
+            </w:pPr>
+            <w:r>
+              <w:rPr>
+                <w:rFonts w:ascii="Arial" w:cs="Arial" w:eastAsia="Arial" w:hAnsi="Arial"/>
+                <w:b w:val="false"/>
+                <w:bCs w:val="false"/>
+                <w:sz w:val="19"/>
+                <w:szCs w:val="19"/>
+              </w:rPr>
+              <w:t xml:space="preserve">all 938 found</w:t>
+            </w:r>
+          </w:p>
+        </w:tc>
+      </w:tr>
+      <w:tr>
+        <w:trPr>
+          <w:tblHeader w:val="off"/>
+        </w:trPr>
+        <w:tc>
+          <w:tcPr>
+            <w:tcW w:type="dxa" w:w="4200"/>
+            <w:tcBorders>
+              <w:top w:val="single" w:color="BBBBBB" w:sz="4"/>
+              <w:left w:val="single" w:color="BBBBBB" w:sz="4"/>
+              <w:bottom w:val="single" w:color="BBBBBB" w:sz="4"/>
+              <w:right w:val="single" w:color="BBBBBB" w:sz="4"/>
+            </w:tcBorders>
+            <w:tcMar>
+              <w:top w:type="dxa" w:w="60"/>
+              <w:left w:type="dxa" w:w="100"/>
+              <w:bottom w:type="dxa" w:w="60"/>
+              <w:right w:type="dxa" w:w="100"/>
+            </w:tcMar>
+          </w:tcPr>
+          <w:p>
+            <w:pPr>
+              <w:keepNext/>
+            </w:pPr>
+            <w:r>
+              <w:rPr>
+                <w:rFonts w:ascii="Arial" w:cs="Arial" w:eastAsia="Arial" w:hAnsi="Arial"/>
+                <w:b w:val="false"/>
+                <w:bCs w:val="false"/>
+                <w:sz w:val="19"/>
+                <w:szCs w:val="19"/>
+              </w:rPr>
+              <w:t xml:space="preserve">Precision</w:t>
+            </w:r>
+          </w:p>
+        </w:tc>
+        <w:tc>
+          <w:tcPr>
+            <w:tcW w:type="dxa" w:w="2400"/>
+            <w:tcBorders>
+              <w:top w:val="single" w:color="BBBBBB" w:sz="4"/>
+              <w:left w:val="single" w:color="BBBBBB" w:sz="4"/>
+              <w:bottom w:val="single" w:color="BBBBBB" w:sz="4"/>
+              <w:right w:val="single" w:color="BBBBBB" w:sz="4"/>
+            </w:tcBorders>
+            <w:tcMar>
+              <w:top w:type="dxa" w:w="60"/>
+              <w:left w:type="dxa" w:w="100"/>
+              <w:bottom w:type="dxa" w:w="60"/>
+              <w:right w:type="dxa" w:w="100"/>
+            </w:tcMar>
+          </w:tcPr>
+          <w:p>
+            <w:pPr>
+              <w:keepNext/>
+            </w:pPr>
+            <w:r>
+              <w:rPr>
+                <w:rFonts w:ascii="Arial" w:cs="Arial" w:eastAsia="Arial" w:hAnsi="Arial"/>
+                <w:b w:val="false"/>
+                <w:bCs w:val="false"/>
+                <w:sz w:val="19"/>
+                <w:szCs w:val="19"/>
+              </w:rPr>
+              <w:t xml:space="preserve">0.953</w:t>
+            </w:r>
+          </w:p>
+        </w:tc>
+        <w:tc>
+          <w:tcPr>
+            <w:tcW w:type="dxa" w:w="2400"/>
+            <w:tcBorders>
+              <w:top w:val="single" w:color="BBBBBB" w:sz="4"/>
+              <w:left w:val="single" w:color="BBBBBB" w:sz="4"/>
+              <w:bottom w:val="single" w:color="BBBBBB" w:sz="4"/>
+              <w:right w:val="single" w:color="BBBBBB" w:sz="4"/>
+            </w:tcBorders>
+            <w:tcMar>
+              <w:top w:type="dxa" w:w="60"/>
+              <w:left w:type="dxa" w:w="100"/>
+              <w:bottom w:type="dxa" w:w="60"/>
+              <w:right w:type="dxa" w:w="100"/>
+            </w:tcMar>
+          </w:tcPr>
+          <w:p>
+            <w:pPr>
+              <w:keepNext/>
+            </w:pPr>
+            <w:r>
+              <w:rPr>
+                <w:rFonts w:ascii="Arial" w:cs="Arial" w:eastAsia="Arial" w:hAnsi="Arial"/>
+                <w:b w:val="false"/>
+                <w:bCs w:val="false"/>
+                <w:sz w:val="19"/>
+                <w:szCs w:val="19"/>
+              </w:rPr>
+              <w:t xml:space="preserve">46 genuine orders flagged</w:t>
+            </w:r>
+          </w:p>
+        </w:tc>
+      </w:tr>
+      <w:tr>
+        <w:trPr>
+          <w:tblHeader w:val="off"/>
+        </w:trPr>
+        <w:tc>
+          <w:tcPr>
+            <w:tcW w:type="dxa" w:w="4200"/>
+            <w:tcBorders>
+              <w:top w:val="single" w:color="BBBBBB" w:sz="4"/>
+              <w:left w:val="single" w:color="BBBBBB" w:sz="4"/>
+              <w:bottom w:val="single" w:color="BBBBBB" w:sz="4"/>
+              <w:right w:val="single" w:color="BBBBBB" w:sz="4"/>
+            </w:tcBorders>
+            <w:tcMar>
+              <w:top w:type="dxa" w:w="60"/>
+              <w:left w:type="dxa" w:w="100"/>
+              <w:bottom w:type="dxa" w:w="60"/>
+              <w:right w:type="dxa" w:w="100"/>
+            </w:tcMar>
+          </w:tcPr>
+          <w:p>
+            <w:pPr>
+              <w:keepNext w:val="false"/>
+            </w:pPr>
+            <w:r>
+              <w:rPr>
+                <w:rFonts w:ascii="Arial" w:cs="Arial" w:eastAsia="Arial" w:hAnsi="Arial"/>
+                <w:b w:val="false"/>
+                <w:bCs w:val="false"/>
+                <w:sz w:val="19"/>
+                <w:szCs w:val="19"/>
+              </w:rPr>
+              <w:t xml:space="preserve">Rows used for modelling</w:t>
+            </w:r>
+          </w:p>
+        </w:tc>
+        <w:tc>
+          <w:tcPr>
+            <w:tcW w:type="dxa" w:w="2400"/>
+            <w:tcBorders>
+              <w:top w:val="single" w:color="BBBBBB" w:sz="4"/>
+              <w:left w:val="single" w:color="BBBBBB" w:sz="4"/>
+              <w:bottom w:val="single" w:color="BBBBBB" w:sz="4"/>
+              <w:right w:val="single" w:color="BBBBBB" w:sz="4"/>
+            </w:tcBorders>
+            <w:tcMar>
+              <w:top w:type="dxa" w:w="60"/>
+              <w:left w:type="dxa" w:w="100"/>
+              <w:bottom w:type="dxa" w:w="60"/>
+              <w:right w:type="dxa" w:w="100"/>
+            </w:tcMar>
+          </w:tcPr>
+          <w:p>
+            <w:pPr>
+              <w:keepNext w:val="false"/>
+            </w:pPr>
+            <w:r>
+              <w:rPr>
+                <w:rFonts w:ascii="Arial" w:cs="Arial" w:eastAsia="Arial" w:hAnsi="Arial"/>
+                <w:b w:val="false"/>
+                <w:bCs w:val="false"/>
+                <w:sz w:val="19"/>
+                <w:szCs w:val="19"/>
+              </w:rPr>
+              <w:t xml:space="preserve">30,272</w:t>
+            </w:r>
+          </w:p>
+        </w:tc>
+        <w:tc>
+          <w:tcPr>
+            <w:tcW w:type="dxa" w:w="2400"/>
+            <w:tcBorders>
+              <w:top w:val="single" w:color="BBBBBB" w:sz="4"/>
+              <w:left w:val="single" w:color="BBBBBB" w:sz="4"/>
+              <w:bottom w:val="single" w:color="BBBBBB" w:sz="4"/>
+              <w:right w:val="single" w:color="BBBBBB" w:sz="4"/>
+            </w:tcBorders>
+            <w:tcMar>
+              <w:top w:type="dxa" w:w="60"/>
+              <w:left w:type="dxa" w:w="100"/>
+              <w:bottom w:type="dxa" w:w="60"/>
+              <w:right w:type="dxa" w:w="100"/>
+            </w:tcMar>
+          </w:tcPr>
+          <w:p>
+            <w:pPr>
+              <w:keepNext w:val="false"/>
+            </w:pPr>
+            <w:r>
+              <w:rPr>
+                <w:rFonts w:ascii="Arial" w:cs="Arial" w:eastAsia="Arial" w:hAnsi="Arial"/>
+                <w:b w:val="false"/>
+                <w:bCs w:val="false"/>
+                <w:sz w:val="19"/>
+                <w:szCs w:val="19"/>
+              </w:rPr>
+              <w:t xml:space="preserve">4,994 customers</w:t>
+            </w:r>
+          </w:p>
+        </w:tc>
+      </w:tr>
+    </w:tbl>
+    <w:p>
+      <w:pPr>
+        <w:spacing w:after="120"/>
+      </w:pPr>
+    </w:p>
+    <w:p>
+      <w:pPr>
+        <w:spacing w:after="140" w:line="300"/>
+        <w:jc w:val="both"/>
+      </w:pPr>
+      <w:r>
+        <w:rPr>
+          <w:rFonts w:ascii="Arial" w:cs="Arial" w:eastAsia="Arial" w:hAnsi="Arial"/>
+          <w:sz w:val="21"/>
+          <w:szCs w:val="21"/>
+        </w:rPr>
+        <w:t xml:space="preserve">All anomalies were found, but 46 genuine large orders were also removed, because genuine order values have a long tail that overlaps with the anomalies. Six customers, each with a single very large genuine order, disappear entirely, which is why the cleaned data have 4,994 customers. The removal rule is a trade-off: a stricter rule would keep more genuine orders but let some anomalies through. These detection scores are optimistic, because the injected anomalies are far from normal values by design; real anomalies are rarely so clear.</w:t>
+      </w:r>
+    </w:p>
+    <w:p>
+      <w:pPr>
+        <w:pStyle w:val="Heading2"/>
+        <w:keepNext/>
+        <w:spacing w:after="100" w:before="200"/>
+      </w:pPr>
+      <w:r>
+        <w:rPr>
+          <w:rFonts w:ascii="Arial" w:cs="Arial" w:eastAsia="Arial" w:hAnsi="Arial"/>
+          <w:b/>
+          <w:bCs/>
+          <w:color w:val="404040"/>
+          <w:sz w:val="24"/>
+          <w:szCs w:val="24"/>
+        </w:rPr>
+        <w:t xml:space="preserve">6.3 Method</w:t>
       </w:r>
     </w:p>
     <w:p>
@@ -5263,7 +6319,7 @@
           <w:sz w:val="21"/>
           <w:szCs w:val="21"/>
         </w:rPr>
-        <w:t xml:space="preserve">Gamma-Gamma (GammaGammaFitter) was fitted on customers with at least one repeat purchase to estimate the expected order value. Its assumption that order value is independent of purchase frequency was checked: the correlation is -0.007, so the assumption holds.</w:t>
+        <w:t xml:space="preserve">Gamma-Gamma (GammaGammaFitter) was fitted on customers with at least one repeat purchase to estimate the expected order value. Its assumption that order value is independent of purchase frequency was checked: the correlation is -0.006, so the assumption holds.</w:t>
       </w:r>
     </w:p>
     <w:p>
@@ -5281,12 +6337,31 @@
           <w:sz w:val="21"/>
           <w:szCs w:val="21"/>
         </w:rPr>
+        <w:t xml:space="preserve">All runs are tracked with MLflow (parameters, metrics and files, stored in mlflow.db).</w:t>
+      </w:r>
+    </w:p>
+    <w:p>
+      <w:pPr>
+        <w:pStyle w:val="ListParagraph"/>
+        <w:numPr>
+          <w:ilvl w:val="0"/>
+          <w:numId w:val="2"/>
+        </w:numPr>
+        <w:spacing w:after="80" w:line="290"/>
+      </w:pPr>
+      <w:r>
+        <w:rPr>
+          <w:rFonts w:ascii="Arial" w:cs="Arial" w:eastAsia="Arial" w:hAnsi="Arial"/>
+          <w:sz w:val="21"/>
+          <w:szCs w:val="21"/>
+        </w:rPr>
         <w:t xml:space="preserve">12-month CLV = expected purchases over 365 days × expected order value, discounted by 10% for the year. Customers with no repeat purchase use the average order value of repeat buyers.</w:t>
       </w:r>
     </w:p>
     <w:p>
       <w:pPr>
         <w:pStyle w:val="Heading2"/>
+        <w:keepNext/>
         <w:spacing w:after="100" w:before="200"/>
       </w:pPr>
       <w:r>
@@ -5298,7 +6373,7 @@
           <w:sz w:val="24"/>
           <w:szCs w:val="24"/>
         </w:rPr>
-        <w:t xml:space="preserve">6.3 Fit and validation</w:t>
+        <w:t xml:space="preserve">6.4 Fit and validation</w:t>
       </w:r>
     </w:p>
     <w:tbl>
@@ -5341,6 +6416,9 @@
             </w:tcMar>
           </w:tcPr>
           <w:p>
+            <w:pPr>
+              <w:keepNext/>
+            </w:pPr>
             <w:r>
               <w:rPr>
                 <w:rFonts w:ascii="Arial" w:cs="Arial" w:eastAsia="Arial" w:hAnsi="Arial"/>
@@ -5371,6 +6449,9 @@
             </w:tcMar>
           </w:tcPr>
           <w:p>
+            <w:pPr>
+              <w:keepNext/>
+            </w:pPr>
             <w:r>
               <w:rPr>
                 <w:rFonts w:ascii="Arial" w:cs="Arial" w:eastAsia="Arial" w:hAnsi="Arial"/>
@@ -5401,6 +6482,9 @@
             </w:tcMar>
           </w:tcPr>
           <w:p>
+            <w:pPr>
+              <w:keepNext/>
+            </w:pPr>
             <w:r>
               <w:rPr>
                 <w:rFonts w:ascii="Arial" w:cs="Arial" w:eastAsia="Arial" w:hAnsi="Arial"/>
@@ -5431,6 +6515,9 @@
             </w:tcMar>
           </w:tcPr>
           <w:p>
+            <w:pPr>
+              <w:keepNext/>
+            </w:pPr>
             <w:r>
               <w:rPr>
                 <w:rFonts w:ascii="Arial" w:cs="Arial" w:eastAsia="Arial" w:hAnsi="Arial"/>
@@ -5465,6 +6552,9 @@
             </w:tcMar>
           </w:tcPr>
           <w:p>
+            <w:pPr>
+              <w:keepNext/>
+            </w:pPr>
             <w:r>
               <w:rPr>
                 <w:rFonts w:ascii="Arial" w:cs="Arial" w:eastAsia="Arial" w:hAnsi="Arial"/>
@@ -5494,6 +6584,9 @@
             </w:tcMar>
           </w:tcPr>
           <w:p>
+            <w:pPr>
+              <w:keepNext/>
+            </w:pPr>
             <w:r>
               <w:rPr>
                 <w:rFonts w:ascii="Arial" w:cs="Arial" w:eastAsia="Arial" w:hAnsi="Arial"/>
@@ -5523,15 +6616,18 @@
             </w:tcMar>
           </w:tcPr>
           <w:p>
-            <w:r>
-              <w:rPr>
-                <w:rFonts w:ascii="Arial" w:cs="Arial" w:eastAsia="Arial" w:hAnsi="Arial"/>
-                <w:b w:val="false"/>
-                <w:bCs w:val="false"/>
-                <w:sz w:val="19"/>
-                <w:szCs w:val="19"/>
-              </w:rPr>
-              <w:t xml:space="preserve">0.557</w:t>
+            <w:pPr>
+              <w:keepNext/>
+            </w:pPr>
+            <w:r>
+              <w:rPr>
+                <w:rFonts w:ascii="Arial" w:cs="Arial" w:eastAsia="Arial" w:hAnsi="Arial"/>
+                <w:b w:val="false"/>
+                <w:bCs w:val="false"/>
+                <w:sz w:val="19"/>
+                <w:szCs w:val="19"/>
+              </w:rPr>
+              <w:t xml:space="preserve">0.558</w:t>
             </w:r>
           </w:p>
         </w:tc>
@@ -5552,6 +6648,9 @@
             </w:tcMar>
           </w:tcPr>
           <w:p>
+            <w:pPr>
+              <w:keepNext/>
+            </w:pPr>
             <w:r>
               <w:rPr>
                 <w:rFonts w:ascii="Arial" w:cs="Arial" w:eastAsia="Arial" w:hAnsi="Arial"/>
@@ -5586,6 +6685,9 @@
             </w:tcMar>
           </w:tcPr>
           <w:p>
+            <w:pPr>
+              <w:keepNext/>
+            </w:pPr>
             <w:r>
               <w:rPr>
                 <w:rFonts w:ascii="Arial" w:cs="Arial" w:eastAsia="Arial" w:hAnsi="Arial"/>
@@ -5615,6 +6717,9 @@
             </w:tcMar>
           </w:tcPr>
           <w:p>
+            <w:pPr>
+              <w:keepNext/>
+            </w:pPr>
             <w:r>
               <w:rPr>
                 <w:rFonts w:ascii="Arial" w:cs="Arial" w:eastAsia="Arial" w:hAnsi="Arial"/>
@@ -5644,15 +6749,18 @@
             </w:tcMar>
           </w:tcPr>
           <w:p>
-            <w:r>
-              <w:rPr>
-                <w:rFonts w:ascii="Arial" w:cs="Arial" w:eastAsia="Arial" w:hAnsi="Arial"/>
-                <w:b w:val="false"/>
-                <w:bCs w:val="false"/>
-                <w:sz w:val="19"/>
-                <w:szCs w:val="19"/>
-              </w:rPr>
-              <w:t xml:space="preserve">46.73</w:t>
+            <w:pPr>
+              <w:keepNext/>
+            </w:pPr>
+            <w:r>
+              <w:rPr>
+                <w:rFonts w:ascii="Arial" w:cs="Arial" w:eastAsia="Arial" w:hAnsi="Arial"/>
+                <w:b w:val="false"/>
+                <w:bCs w:val="false"/>
+                <w:sz w:val="19"/>
+                <w:szCs w:val="19"/>
+              </w:rPr>
+              <w:t xml:space="preserve">46.75</w:t>
             </w:r>
           </w:p>
         </w:tc>
@@ -5673,6 +6781,9 @@
             </w:tcMar>
           </w:tcPr>
           <w:p>
+            <w:pPr>
+              <w:keepNext/>
+            </w:pPr>
             <w:r>
               <w:rPr>
                 <w:rFonts w:ascii="Arial" w:cs="Arial" w:eastAsia="Arial" w:hAnsi="Arial"/>
@@ -5707,6 +6818,9 @@
             </w:tcMar>
           </w:tcPr>
           <w:p>
+            <w:pPr>
+              <w:keepNext/>
+            </w:pPr>
             <w:r>
               <w:rPr>
                 <w:rFonts w:ascii="Arial" w:cs="Arial" w:eastAsia="Arial" w:hAnsi="Arial"/>
@@ -5736,6 +6850,9 @@
             </w:tcMar>
           </w:tcPr>
           <w:p>
+            <w:pPr>
+              <w:keepNext/>
+            </w:pPr>
             <w:r>
               <w:rPr>
                 <w:rFonts w:ascii="Arial" w:cs="Arial" w:eastAsia="Arial" w:hAnsi="Arial"/>
@@ -5765,6 +6882,9 @@
             </w:tcMar>
           </w:tcPr>
           <w:p>
+            <w:pPr>
+              <w:keepNext/>
+            </w:pPr>
             <w:r>
               <w:rPr>
                 <w:rFonts w:ascii="Arial" w:cs="Arial" w:eastAsia="Arial" w:hAnsi="Arial"/>
@@ -5794,6 +6914,9 @@
             </w:tcMar>
           </w:tcPr>
           <w:p>
+            <w:pPr>
+              <w:keepNext/>
+            </w:pPr>
             <w:r>
               <w:rPr>
                 <w:rFonts w:ascii="Arial" w:cs="Arial" w:eastAsia="Arial" w:hAnsi="Arial"/>
@@ -5828,6 +6951,9 @@
             </w:tcMar>
           </w:tcPr>
           <w:p>
+            <w:pPr>
+              <w:keepNext w:val="false"/>
+            </w:pPr>
             <w:r>
               <w:rPr>
                 <w:rFonts w:ascii="Arial" w:cs="Arial" w:eastAsia="Arial" w:hAnsi="Arial"/>
@@ -5857,6 +6983,9 @@
             </w:tcMar>
           </w:tcPr>
           <w:p>
+            <w:pPr>
+              <w:keepNext w:val="false"/>
+            </w:pPr>
             <w:r>
               <w:rPr>
                 <w:rFonts w:ascii="Arial" w:cs="Arial" w:eastAsia="Arial" w:hAnsi="Arial"/>
@@ -5886,15 +7015,18 @@
             </w:tcMar>
           </w:tcPr>
           <w:p>
-            <w:r>
-              <w:rPr>
-                <w:rFonts w:ascii="Arial" w:cs="Arial" w:eastAsia="Arial" w:hAnsi="Arial"/>
-                <w:b w:val="false"/>
-                <w:bCs w:val="false"/>
-                <w:sz w:val="19"/>
-                <w:szCs w:val="19"/>
-              </w:rPr>
-              <w:t xml:space="preserve">1.201</w:t>
+            <w:pPr>
+              <w:keepNext w:val="false"/>
+            </w:pPr>
+            <w:r>
+              <w:rPr>
+                <w:rFonts w:ascii="Arial" w:cs="Arial" w:eastAsia="Arial" w:hAnsi="Arial"/>
+                <w:b w:val="false"/>
+                <w:bCs w:val="false"/>
+                <w:sz w:val="19"/>
+                <w:szCs w:val="19"/>
+              </w:rPr>
+              <w:t xml:space="preserve">1.195</w:t>
             </w:r>
           </w:p>
         </w:tc>
@@ -5915,6 +7047,9 @@
             </w:tcMar>
           </w:tcPr>
           <w:p>
+            <w:pPr>
+              <w:keepNext w:val="false"/>
+            </w:pPr>
             <w:r>
               <w:rPr>
                 <w:rFonts w:ascii="Arial" w:cs="Arial" w:eastAsia="Arial" w:hAnsi="Arial"/>
@@ -5945,7 +7080,7 @@
           <w:sz w:val="21"/>
           <w:szCs w:val="21"/>
         </w:rPr>
-        <w:t xml:space="preserve">The purchase-rate parameters r and alpha are recovered closely. The dropout parameters a and b are less well recovered individually (0.274 and 1.201 against 0.35 and 1.60), but their ratio, which determines the average dropout probability, is similar (0.186 fitted against 0.179 true). This is a known feature of the model, where a and b are hard to separate.</w:t>
+        <w:t xml:space="preserve">The purchase-rate parameters r and alpha are recovered closely. The dropout parameters a and b are less well recovered individually (0.274 and 1.195 against 0.35 and 1.60), but their ratio, which determines the average dropout probability, is similar (0.187 fitted against 0.179 true). This is a known feature of the model, where a and b are hard to separate.</w:t>
       </w:r>
     </w:p>
     <w:p>
@@ -6022,12 +7157,13 @@
           <w:sz w:val="21"/>
           <w:szCs w:val="21"/>
         </w:rPr>
-        <w:t xml:space="preserve">In the holdout year, customers made 10,445 repeat purchases and BG/NBD predicted 10,789, an error of +3.3% in total. The correlation between predicted and actual purchases per customer is 0.75, and the prediction follows the actual curve across customer groups in Figure 9. For order value, Gamma-Gamma predicted an average of 1,558 against an actual 1,512 for customers who purchased again in the holdout year (+3.1%); simply using each customer’s past average gave 1,527. The fitted Gamma-Gamma parameters (p = 12.9, q = 0.49) differ from the simulation values; as with a and b, predictions are good even though the individual parameters are poorly identified, so they should not be interpreted on their own.</w:t>
+        <w:t xml:space="preserve">In the holdout year, customers made 10,432 repeat purchases and BG/NBD predicted 10,765, an error of +3.2% in total. The correlation between predicted and actual purchases per customer is 0.75, and the prediction follows the actual curve across customer groups in Figure 9. For order value, Gamma-Gamma predicted an average of 1,534 against an actual 1,498 for customers who purchased again in the holdout year (+2.5%); simply using each customer’s past average gave 1,504. The fitted Gamma-Gamma parameters (p = 12.9, q = 0.49) differ from the simulation values; as with a and b, predictions are good even though the individual parameters are poorly identified, so they should not be interpreted on their own.</w:t>
       </w:r>
     </w:p>
     <w:p>
       <w:pPr>
         <w:pStyle w:val="Heading2"/>
+        <w:keepNext/>
         <w:spacing w:after="100" w:before="200"/>
       </w:pPr>
       <w:r>
@@ -6039,7 +7175,7 @@
           <w:sz w:val="24"/>
           <w:szCs w:val="24"/>
         </w:rPr>
-        <w:t xml:space="preserve">6.4 Comparison with machine-learning regression</w:t>
+        <w:t xml:space="preserve">6.5 Comparison with machine-learning regression</w:t>
       </w:r>
     </w:p>
     <w:p>
@@ -6096,6 +7232,9 @@
             </w:tcMar>
           </w:tcPr>
           <w:p>
+            <w:pPr>
+              <w:keepNext/>
+            </w:pPr>
             <w:r>
               <w:rPr>
                 <w:rFonts w:ascii="Arial" w:cs="Arial" w:eastAsia="Arial" w:hAnsi="Arial"/>
@@ -6126,6 +7265,9 @@
             </w:tcMar>
           </w:tcPr>
           <w:p>
+            <w:pPr>
+              <w:keepNext/>
+            </w:pPr>
             <w:r>
               <w:rPr>
                 <w:rFonts w:ascii="Arial" w:cs="Arial" w:eastAsia="Arial" w:hAnsi="Arial"/>
@@ -6156,6 +7298,9 @@
             </w:tcMar>
           </w:tcPr>
           <w:p>
+            <w:pPr>
+              <w:keepNext/>
+            </w:pPr>
             <w:r>
               <w:rPr>
                 <w:rFonts w:ascii="Arial" w:cs="Arial" w:eastAsia="Arial" w:hAnsi="Arial"/>
@@ -6186,6 +7331,9 @@
             </w:tcMar>
           </w:tcPr>
           <w:p>
+            <w:pPr>
+              <w:keepNext/>
+            </w:pPr>
             <w:r>
               <w:rPr>
                 <w:rFonts w:ascii="Arial" w:cs="Arial" w:eastAsia="Arial" w:hAnsi="Arial"/>
@@ -6220,6 +7368,9 @@
             </w:tcMar>
           </w:tcPr>
           <w:p>
+            <w:pPr>
+              <w:keepNext/>
+            </w:pPr>
             <w:r>
               <w:rPr>
                 <w:rFonts w:ascii="Arial" w:cs="Arial" w:eastAsia="Arial" w:hAnsi="Arial"/>
@@ -6249,15 +7400,18 @@
             </w:tcMar>
           </w:tcPr>
           <w:p>
-            <w:r>
-              <w:rPr>
-                <w:rFonts w:ascii="Arial" w:cs="Arial" w:eastAsia="Arial" w:hAnsi="Arial"/>
-                <w:b w:val="false"/>
-                <w:bCs w:val="false"/>
-                <w:sz w:val="19"/>
-                <w:szCs w:val="19"/>
-              </w:rPr>
-              <w:t xml:space="preserve">-0.002</w:t>
+            <w:pPr>
+              <w:keepNext/>
+            </w:pPr>
+            <w:r>
+              <w:rPr>
+                <w:rFonts w:ascii="Arial" w:cs="Arial" w:eastAsia="Arial" w:hAnsi="Arial"/>
+                <w:b w:val="false"/>
+                <w:bCs w:val="false"/>
+                <w:sz w:val="19"/>
+                <w:szCs w:val="19"/>
+              </w:rPr>
+              <w:t xml:space="preserve">0.000</w:t>
             </w:r>
           </w:p>
         </w:tc>
@@ -6278,15 +7432,18 @@
             </w:tcMar>
           </w:tcPr>
           <w:p>
-            <w:r>
-              <w:rPr>
-                <w:rFonts w:ascii="Arial" w:cs="Arial" w:eastAsia="Arial" w:hAnsi="Arial"/>
-                <w:b w:val="false"/>
-                <w:bCs w:val="false"/>
-                <w:sz w:val="19"/>
-                <w:szCs w:val="19"/>
-              </w:rPr>
-              <w:t xml:space="preserve">4,069</w:t>
+            <w:pPr>
+              <w:keepNext/>
+            </w:pPr>
+            <w:r>
+              <w:rPr>
+                <w:rFonts w:ascii="Arial" w:cs="Arial" w:eastAsia="Arial" w:hAnsi="Arial"/>
+                <w:b w:val="false"/>
+                <w:bCs w:val="false"/>
+                <w:sz w:val="19"/>
+                <w:szCs w:val="19"/>
+              </w:rPr>
+              <w:t xml:space="preserve">3,997</w:t>
             </w:r>
           </w:p>
         </w:tc>
@@ -6307,15 +7464,18 @@
             </w:tcMar>
           </w:tcPr>
           <w:p>
-            <w:r>
-              <w:rPr>
-                <w:rFonts w:ascii="Arial" w:cs="Arial" w:eastAsia="Arial" w:hAnsi="Arial"/>
-                <w:b w:val="false"/>
-                <w:bCs w:val="false"/>
-                <w:sz w:val="19"/>
-                <w:szCs w:val="19"/>
-              </w:rPr>
-              <w:t xml:space="preserve">12.7%</w:t>
+            <w:pPr>
+              <w:keepNext/>
+            </w:pPr>
+            <w:r>
+              <w:rPr>
+                <w:rFonts w:ascii="Arial" w:cs="Arial" w:eastAsia="Arial" w:hAnsi="Arial"/>
+                <w:b w:val="false"/>
+                <w:bCs w:val="false"/>
+                <w:sz w:val="19"/>
+                <w:szCs w:val="19"/>
+              </w:rPr>
+              <w:t xml:space="preserve">8.8%</w:t>
             </w:r>
           </w:p>
         </w:tc>
@@ -6341,6 +7501,9 @@
             </w:tcMar>
           </w:tcPr>
           <w:p>
+            <w:pPr>
+              <w:keepNext/>
+            </w:pPr>
             <w:r>
               <w:rPr>
                 <w:rFonts w:ascii="Arial" w:cs="Arial" w:eastAsia="Arial" w:hAnsi="Arial"/>
@@ -6370,15 +7533,18 @@
             </w:tcMar>
           </w:tcPr>
           <w:p>
-            <w:r>
-              <w:rPr>
-                <w:rFonts w:ascii="Arial" w:cs="Arial" w:eastAsia="Arial" w:hAnsi="Arial"/>
-                <w:b w:val="false"/>
-                <w:bCs w:val="false"/>
-                <w:sz w:val="19"/>
-                <w:szCs w:val="19"/>
-              </w:rPr>
-              <w:t xml:space="preserve">0.574</w:t>
+            <w:pPr>
+              <w:keepNext/>
+            </w:pPr>
+            <w:r>
+              <w:rPr>
+                <w:rFonts w:ascii="Arial" w:cs="Arial" w:eastAsia="Arial" w:hAnsi="Arial"/>
+                <w:b w:val="false"/>
+                <w:bCs w:val="false"/>
+                <w:sz w:val="19"/>
+                <w:szCs w:val="19"/>
+              </w:rPr>
+              <w:t xml:space="preserve">0.606</w:t>
             </w:r>
           </w:p>
         </w:tc>
@@ -6399,15 +7565,18 @@
             </w:tcMar>
           </w:tcPr>
           <w:p>
-            <w:r>
-              <w:rPr>
-                <w:rFonts w:ascii="Arial" w:cs="Arial" w:eastAsia="Arial" w:hAnsi="Arial"/>
-                <w:b w:val="false"/>
-                <w:bCs w:val="false"/>
-                <w:sz w:val="19"/>
-                <w:szCs w:val="19"/>
-              </w:rPr>
-              <w:t xml:space="preserve">2,639</w:t>
+            <w:pPr>
+              <w:keepNext/>
+            </w:pPr>
+            <w:r>
+              <w:rPr>
+                <w:rFonts w:ascii="Arial" w:cs="Arial" w:eastAsia="Arial" w:hAnsi="Arial"/>
+                <w:b w:val="false"/>
+                <w:bCs w:val="false"/>
+                <w:sz w:val="19"/>
+                <w:szCs w:val="19"/>
+              </w:rPr>
+              <w:t xml:space="preserve">2,444</w:t>
             </w:r>
           </w:p>
         </w:tc>
@@ -6428,15 +7597,18 @@
             </w:tcMar>
           </w:tcPr>
           <w:p>
-            <w:r>
-              <w:rPr>
-                <w:rFonts w:ascii="Arial" w:cs="Arial" w:eastAsia="Arial" w:hAnsi="Arial"/>
-                <w:b w:val="false"/>
-                <w:bCs w:val="false"/>
-                <w:sz w:val="19"/>
-                <w:szCs w:val="19"/>
-              </w:rPr>
-              <w:t xml:space="preserve">50.4%</w:t>
+            <w:pPr>
+              <w:keepNext/>
+            </w:pPr>
+            <w:r>
+              <w:rPr>
+                <w:rFonts w:ascii="Arial" w:cs="Arial" w:eastAsia="Arial" w:hAnsi="Arial"/>
+                <w:b w:val="false"/>
+                <w:bCs w:val="false"/>
+                <w:sz w:val="19"/>
+                <w:szCs w:val="19"/>
+              </w:rPr>
+              <w:t xml:space="preserve">52.2%</w:t>
             </w:r>
           </w:p>
         </w:tc>
@@ -6462,6 +7634,9 @@
             </w:tcMar>
           </w:tcPr>
           <w:p>
+            <w:pPr>
+              <w:keepNext w:val="false"/>
+            </w:pPr>
             <w:r>
               <w:rPr>
                 <w:rFonts w:ascii="Arial" w:cs="Arial" w:eastAsia="Arial" w:hAnsi="Arial"/>
@@ -6491,15 +7666,18 @@
             </w:tcMar>
           </w:tcPr>
           <w:p>
-            <w:r>
-              <w:rPr>
-                <w:rFonts w:ascii="Arial" w:cs="Arial" w:eastAsia="Arial" w:hAnsi="Arial"/>
-                <w:b w:val="false"/>
-                <w:bCs w:val="false"/>
-                <w:sz w:val="19"/>
-                <w:szCs w:val="19"/>
-              </w:rPr>
-              <w:t xml:space="preserve">0.523</w:t>
+            <w:pPr>
+              <w:keepNext w:val="false"/>
+            </w:pPr>
+            <w:r>
+              <w:rPr>
+                <w:rFonts w:ascii="Arial" w:cs="Arial" w:eastAsia="Arial" w:hAnsi="Arial"/>
+                <w:b w:val="false"/>
+                <w:bCs w:val="false"/>
+                <w:sz w:val="19"/>
+                <w:szCs w:val="19"/>
+              </w:rPr>
+              <w:t xml:space="preserve">0.513</w:t>
             </w:r>
           </w:p>
         </w:tc>
@@ -6520,15 +7698,18 @@
             </w:tcMar>
           </w:tcPr>
           <w:p>
-            <w:r>
-              <w:rPr>
-                <w:rFonts w:ascii="Arial" w:cs="Arial" w:eastAsia="Arial" w:hAnsi="Arial"/>
-                <w:b w:val="false"/>
-                <w:bCs w:val="false"/>
-                <w:sz w:val="19"/>
-                <w:szCs w:val="19"/>
-              </w:rPr>
-              <w:t xml:space="preserve">2,789</w:t>
+            <w:pPr>
+              <w:keepNext w:val="false"/>
+            </w:pPr>
+            <w:r>
+              <w:rPr>
+                <w:rFonts w:ascii="Arial" w:cs="Arial" w:eastAsia="Arial" w:hAnsi="Arial"/>
+                <w:b w:val="false"/>
+                <w:bCs w:val="false"/>
+                <w:sz w:val="19"/>
+                <w:szCs w:val="19"/>
+              </w:rPr>
+              <w:t xml:space="preserve">2,748</w:t>
             </w:r>
           </w:p>
         </w:tc>
@@ -6549,15 +7730,18 @@
             </w:tcMar>
           </w:tcPr>
           <w:p>
-            <w:r>
-              <w:rPr>
-                <w:rFonts w:ascii="Arial" w:cs="Arial" w:eastAsia="Arial" w:hAnsi="Arial"/>
-                <w:b w:val="false"/>
-                <w:bCs w:val="false"/>
-                <w:sz w:val="19"/>
-                <w:szCs w:val="19"/>
-              </w:rPr>
-              <w:t xml:space="preserve">47.3%</w:t>
+            <w:pPr>
+              <w:keepNext w:val="false"/>
+            </w:pPr>
+            <w:r>
+              <w:rPr>
+                <w:rFonts w:ascii="Arial" w:cs="Arial" w:eastAsia="Arial" w:hAnsi="Arial"/>
+                <w:b w:val="false"/>
+                <w:bCs w:val="false"/>
+                <w:sz w:val="19"/>
+                <w:szCs w:val="19"/>
+              </w:rPr>
+              <w:t xml:space="preserve">47.1%</w:t>
             </w:r>
           </w:p>
         </w:tc>
@@ -6579,12 +7763,13 @@
           <w:sz w:val="21"/>
           <w:szCs w:val="21"/>
         </w:rPr>
-        <w:t xml:space="preserve">Both models are far better than the naive prediction, and the ten percent of customers ranked highest capture around half of next-year spend. BG/NBD is slightly ahead of gradient boosting on every measure (R² 0.574 against 0.523), although it was not trained on the holdout spend and gradient boosting was. The difference is small, however, and should not be over-stated: the data follow the BG/NBD process by construction, so an advantage for it is expected. These R² values (about 0.5–0.6) are much more realistic than the 0.947 in Section 5, because here the target is future behaviour, which contains real randomness, and not a formula.</w:t>
+        <w:t xml:space="preserve">Both models are far better than the naive prediction, and the ten percent of customers ranked highest capture around half of next-year spend. BG/NBD is slightly ahead of gradient boosting on every measure (R² 0.606 against 0.513), although it was not trained on the holdout spend and gradient boosting was. The difference is small, however, and should not be over-stated: the data follow the BG/NBD process by construction, so an advantage for it is expected. These R² values (about 0.5–0.6) are much more realistic than the 0.947 in Section 5, because here the target is future behaviour, which contains real randomness, and not a formula.</w:t>
       </w:r>
     </w:p>
     <w:p>
       <w:pPr>
         <w:pStyle w:val="Heading1"/>
+        <w:keepNext/>
         <w:spacing w:after="160" w:before="320"/>
       </w:pPr>
       <w:r>
@@ -6610,7 +7795,7 @@
           <w:sz w:val="21"/>
           <w:szCs w:val="21"/>
         </w:rPr>
-        <w:t xml:space="preserve">Segments from the transaction-level model use the probability that a customer is still active together with 12-month CLV. Total predicted 12-month CLV for the 5,000 customers is about 12.1 million; the top 5% of customers (250) account for 42.5% of it, and the top 20% for 78.2%.</w:t>
+        <w:t xml:space="preserve">Segments from the transaction-level model use the probability that a customer is still active together with 12-month CLV. Total predicted 12-month CLV for the 5,000 customers is about 12.0 million; the top 5% of customers (250) account for 42.4% of it, and the top 20% for 78.1%.</w:t>
       </w:r>
     </w:p>
     <w:p>
@@ -6717,6 +7902,9 @@
             </w:tcMar>
           </w:tcPr>
           <w:p>
+            <w:pPr>
+              <w:keepNext/>
+            </w:pPr>
             <w:r>
               <w:rPr>
                 <w:rFonts w:ascii="Arial" w:cs="Arial" w:eastAsia="Arial" w:hAnsi="Arial"/>
@@ -6747,6 +7935,9 @@
             </w:tcMar>
           </w:tcPr>
           <w:p>
+            <w:pPr>
+              <w:keepNext/>
+            </w:pPr>
             <w:r>
               <w:rPr>
                 <w:rFonts w:ascii="Arial" w:cs="Arial" w:eastAsia="Arial" w:hAnsi="Arial"/>
@@ -6777,6 +7968,9 @@
             </w:tcMar>
           </w:tcPr>
           <w:p>
+            <w:pPr>
+              <w:keepNext/>
+            </w:pPr>
             <w:r>
               <w:rPr>
                 <w:rFonts w:ascii="Arial" w:cs="Arial" w:eastAsia="Arial" w:hAnsi="Arial"/>
@@ -6807,6 +8001,9 @@
             </w:tcMar>
           </w:tcPr>
           <w:p>
+            <w:pPr>
+              <w:keepNext/>
+            </w:pPr>
             <w:r>
               <w:rPr>
                 <w:rFonts w:ascii="Arial" w:cs="Arial" w:eastAsia="Arial" w:hAnsi="Arial"/>
@@ -6837,6 +8034,9 @@
             </w:tcMar>
           </w:tcPr>
           <w:p>
+            <w:pPr>
+              <w:keepNext/>
+            </w:pPr>
             <w:r>
               <w:rPr>
                 <w:rFonts w:ascii="Arial" w:cs="Arial" w:eastAsia="Arial" w:hAnsi="Arial"/>
@@ -6871,6 +8071,9 @@
             </w:tcMar>
           </w:tcPr>
           <w:p>
+            <w:pPr>
+              <w:keepNext/>
+            </w:pPr>
             <w:r>
               <w:rPr>
                 <w:rFonts w:ascii="Arial" w:cs="Arial" w:eastAsia="Arial" w:hAnsi="Arial"/>
@@ -6900,6 +8103,9 @@
             </w:tcMar>
           </w:tcPr>
           <w:p>
+            <w:pPr>
+              <w:keepNext/>
+            </w:pPr>
             <w:r>
               <w:rPr>
                 <w:rFonts w:ascii="Arial" w:cs="Arial" w:eastAsia="Arial" w:hAnsi="Arial"/>
@@ -6929,15 +8135,18 @@
             </w:tcMar>
           </w:tcPr>
           <w:p>
-            <w:r>
-              <w:rPr>
-                <w:rFonts w:ascii="Arial" w:cs="Arial" w:eastAsia="Arial" w:hAnsi="Arial"/>
-                <w:b w:val="false"/>
-                <w:bCs w:val="false"/>
-                <w:sz w:val="19"/>
-                <w:szCs w:val="19"/>
-              </w:rPr>
-              <w:t xml:space="preserve">5,156,878</w:t>
+            <w:pPr>
+              <w:keepNext/>
+            </w:pPr>
+            <w:r>
+              <w:rPr>
+                <w:rFonts w:ascii="Arial" w:cs="Arial" w:eastAsia="Arial" w:hAnsi="Arial"/>
+                <w:b w:val="false"/>
+                <w:bCs w:val="false"/>
+                <w:sz w:val="19"/>
+                <w:szCs w:val="19"/>
+              </w:rPr>
+              <w:t xml:space="preserve">5,081,590</w:t>
             </w:r>
           </w:p>
         </w:tc>
@@ -6958,15 +8167,18 @@
             </w:tcMar>
           </w:tcPr>
           <w:p>
-            <w:r>
-              <w:rPr>
-                <w:rFonts w:ascii="Arial" w:cs="Arial" w:eastAsia="Arial" w:hAnsi="Arial"/>
-                <w:b w:val="false"/>
-                <w:bCs w:val="false"/>
-                <w:sz w:val="19"/>
-                <w:szCs w:val="19"/>
-              </w:rPr>
-              <w:t xml:space="preserve">20,628</w:t>
+            <w:pPr>
+              <w:keepNext/>
+            </w:pPr>
+            <w:r>
+              <w:rPr>
+                <w:rFonts w:ascii="Arial" w:cs="Arial" w:eastAsia="Arial" w:hAnsi="Arial"/>
+                <w:b w:val="false"/>
+                <w:bCs w:val="false"/>
+                <w:sz w:val="19"/>
+                <w:szCs w:val="19"/>
+              </w:rPr>
+              <w:t xml:space="preserve">20,326</w:t>
             </w:r>
           </w:p>
         </w:tc>
@@ -6987,6 +8199,9 @@
             </w:tcMar>
           </w:tcPr>
           <w:p>
+            <w:pPr>
+              <w:keepNext/>
+            </w:pPr>
             <w:r>
               <w:rPr>
                 <w:rFonts w:ascii="Arial" w:cs="Arial" w:eastAsia="Arial" w:hAnsi="Arial"/>
@@ -7021,6 +8236,9 @@
             </w:tcMar>
           </w:tcPr>
           <w:p>
+            <w:pPr>
+              <w:keepNext/>
+            </w:pPr>
             <w:r>
               <w:rPr>
                 <w:rFonts w:ascii="Arial" w:cs="Arial" w:eastAsia="Arial" w:hAnsi="Arial"/>
@@ -7050,15 +8268,18 @@
             </w:tcMar>
           </w:tcPr>
           <w:p>
-            <w:r>
-              <w:rPr>
-                <w:rFonts w:ascii="Arial" w:cs="Arial" w:eastAsia="Arial" w:hAnsi="Arial"/>
-                <w:b w:val="false"/>
-                <w:bCs w:val="false"/>
-                <w:sz w:val="19"/>
-                <w:szCs w:val="19"/>
-              </w:rPr>
-              <w:t xml:space="preserve">749</w:t>
+            <w:pPr>
+              <w:keepNext/>
+            </w:pPr>
+            <w:r>
+              <w:rPr>
+                <w:rFonts w:ascii="Arial" w:cs="Arial" w:eastAsia="Arial" w:hAnsi="Arial"/>
+                <w:b w:val="false"/>
+                <w:bCs w:val="false"/>
+                <w:sz w:val="19"/>
+                <w:szCs w:val="19"/>
+              </w:rPr>
+              <w:t xml:space="preserve">748</w:t>
             </w:r>
           </w:p>
         </w:tc>
@@ -7079,15 +8300,18 @@
             </w:tcMar>
           </w:tcPr>
           <w:p>
-            <w:r>
-              <w:rPr>
-                <w:rFonts w:ascii="Arial" w:cs="Arial" w:eastAsia="Arial" w:hAnsi="Arial"/>
-                <w:b w:val="false"/>
-                <w:bCs w:val="false"/>
-                <w:sz w:val="19"/>
-                <w:szCs w:val="19"/>
-              </w:rPr>
-              <w:t xml:space="preserve">4,319,168</w:t>
+            <w:pPr>
+              <w:keepNext/>
+            </w:pPr>
+            <w:r>
+              <w:rPr>
+                <w:rFonts w:ascii="Arial" w:cs="Arial" w:eastAsia="Arial" w:hAnsi="Arial"/>
+                <w:b w:val="false"/>
+                <w:bCs w:val="false"/>
+                <w:sz w:val="19"/>
+                <w:szCs w:val="19"/>
+              </w:rPr>
+              <w:t xml:space="preserve">4,282,451</w:t>
             </w:r>
           </w:p>
         </w:tc>
@@ -7108,15 +8332,18 @@
             </w:tcMar>
           </w:tcPr>
           <w:p>
-            <w:r>
-              <w:rPr>
-                <w:rFonts w:ascii="Arial" w:cs="Arial" w:eastAsia="Arial" w:hAnsi="Arial"/>
-                <w:b w:val="false"/>
-                <w:bCs w:val="false"/>
-                <w:sz w:val="19"/>
-                <w:szCs w:val="19"/>
-              </w:rPr>
-              <w:t xml:space="preserve">5,767</w:t>
+            <w:pPr>
+              <w:keepNext/>
+            </w:pPr>
+            <w:r>
+              <w:rPr>
+                <w:rFonts w:ascii="Arial" w:cs="Arial" w:eastAsia="Arial" w:hAnsi="Arial"/>
+                <w:b w:val="false"/>
+                <w:bCs w:val="false"/>
+                <w:sz w:val="19"/>
+                <w:szCs w:val="19"/>
+              </w:rPr>
+              <w:t xml:space="preserve">5,725</w:t>
             </w:r>
           </w:p>
         </w:tc>
@@ -7137,6 +8364,9 @@
             </w:tcMar>
           </w:tcPr>
           <w:p>
+            <w:pPr>
+              <w:keepNext/>
+            </w:pPr>
             <w:r>
               <w:rPr>
                 <w:rFonts w:ascii="Arial" w:cs="Arial" w:eastAsia="Arial" w:hAnsi="Arial"/>
@@ -7171,6 +8401,9 @@
             </w:tcMar>
           </w:tcPr>
           <w:p>
+            <w:pPr>
+              <w:keepNext/>
+            </w:pPr>
             <w:r>
               <w:rPr>
                 <w:rFonts w:ascii="Arial" w:cs="Arial" w:eastAsia="Arial" w:hAnsi="Arial"/>
@@ -7200,15 +8433,18 @@
             </w:tcMar>
           </w:tcPr>
           <w:p>
-            <w:r>
-              <w:rPr>
-                <w:rFonts w:ascii="Arial" w:cs="Arial" w:eastAsia="Arial" w:hAnsi="Arial"/>
-                <w:b w:val="false"/>
-                <w:bCs w:val="false"/>
-                <w:sz w:val="19"/>
-                <w:szCs w:val="19"/>
-              </w:rPr>
-              <w:t xml:space="preserve">1,703</w:t>
+            <w:pPr>
+              <w:keepNext/>
+            </w:pPr>
+            <w:r>
+              <w:rPr>
+                <w:rFonts w:ascii="Arial" w:cs="Arial" w:eastAsia="Arial" w:hAnsi="Arial"/>
+                <w:b w:val="false"/>
+                <w:bCs w:val="false"/>
+                <w:sz w:val="19"/>
+                <w:szCs w:val="19"/>
+              </w:rPr>
+              <w:t xml:space="preserve">1,699</w:t>
             </w:r>
           </w:p>
         </w:tc>
@@ -7229,15 +8465,18 @@
             </w:tcMar>
           </w:tcPr>
           <w:p>
-            <w:r>
-              <w:rPr>
-                <w:rFonts w:ascii="Arial" w:cs="Arial" w:eastAsia="Arial" w:hAnsi="Arial"/>
-                <w:b w:val="false"/>
-                <w:bCs w:val="false"/>
-                <w:sz w:val="19"/>
-                <w:szCs w:val="19"/>
-              </w:rPr>
-              <w:t xml:space="preserve">2,007,480</w:t>
+            <w:pPr>
+              <w:keepNext/>
+            </w:pPr>
+            <w:r>
+              <w:rPr>
+                <w:rFonts w:ascii="Arial" w:cs="Arial" w:eastAsia="Arial" w:hAnsi="Arial"/>
+                <w:b w:val="false"/>
+                <w:bCs w:val="false"/>
+                <w:sz w:val="19"/>
+                <w:szCs w:val="19"/>
+              </w:rPr>
+              <w:t xml:space="preserve">1,998,856</w:t>
             </w:r>
           </w:p>
         </w:tc>
@@ -7258,15 +8497,18 @@
             </w:tcMar>
           </w:tcPr>
           <w:p>
-            <w:r>
-              <w:rPr>
-                <w:rFonts w:ascii="Arial" w:cs="Arial" w:eastAsia="Arial" w:hAnsi="Arial"/>
-                <w:b w:val="false"/>
-                <w:bCs w:val="false"/>
-                <w:sz w:val="19"/>
-                <w:szCs w:val="19"/>
-              </w:rPr>
-              <w:t xml:space="preserve">1,179</w:t>
+            <w:pPr>
+              <w:keepNext/>
+            </w:pPr>
+            <w:r>
+              <w:rPr>
+                <w:rFonts w:ascii="Arial" w:cs="Arial" w:eastAsia="Arial" w:hAnsi="Arial"/>
+                <w:b w:val="false"/>
+                <w:bCs w:val="false"/>
+                <w:sz w:val="19"/>
+                <w:szCs w:val="19"/>
+              </w:rPr>
+              <w:t xml:space="preserve">1,176</w:t>
             </w:r>
           </w:p>
         </w:tc>
@@ -7287,6 +8529,9 @@
             </w:tcMar>
           </w:tcPr>
           <w:p>
+            <w:pPr>
+              <w:keepNext/>
+            </w:pPr>
             <w:r>
               <w:rPr>
                 <w:rFonts w:ascii="Arial" w:cs="Arial" w:eastAsia="Arial" w:hAnsi="Arial"/>
@@ -7321,6 +8566,9 @@
             </w:tcMar>
           </w:tcPr>
           <w:p>
+            <w:pPr>
+              <w:keepNext/>
+            </w:pPr>
             <w:r>
               <w:rPr>
                 <w:rFonts w:ascii="Arial" w:cs="Arial" w:eastAsia="Arial" w:hAnsi="Arial"/>
@@ -7350,15 +8598,18 @@
             </w:tcMar>
           </w:tcPr>
           <w:p>
-            <w:r>
-              <w:rPr>
-                <w:rFonts w:ascii="Arial" w:cs="Arial" w:eastAsia="Arial" w:hAnsi="Arial"/>
-                <w:b w:val="false"/>
-                <w:bCs w:val="false"/>
-                <w:sz w:val="19"/>
-                <w:szCs w:val="19"/>
-              </w:rPr>
-              <w:t xml:space="preserve">1,060</w:t>
+            <w:pPr>
+              <w:keepNext/>
+            </w:pPr>
+            <w:r>
+              <w:rPr>
+                <w:rFonts w:ascii="Arial" w:cs="Arial" w:eastAsia="Arial" w:hAnsi="Arial"/>
+                <w:b w:val="false"/>
+                <w:bCs w:val="false"/>
+                <w:sz w:val="19"/>
+                <w:szCs w:val="19"/>
+              </w:rPr>
+              <w:t xml:space="preserve">1,061</w:t>
             </w:r>
           </w:p>
         </w:tc>
@@ -7379,15 +8630,18 @@
             </w:tcMar>
           </w:tcPr>
           <w:p>
-            <w:r>
-              <w:rPr>
-                <w:rFonts w:ascii="Arial" w:cs="Arial" w:eastAsia="Arial" w:hAnsi="Arial"/>
-                <w:b w:val="false"/>
-                <w:bCs w:val="false"/>
-                <w:sz w:val="19"/>
-                <w:szCs w:val="19"/>
-              </w:rPr>
-              <w:t xml:space="preserve">398,302</w:t>
+            <w:pPr>
+              <w:keepNext/>
+            </w:pPr>
+            <w:r>
+              <w:rPr>
+                <w:rFonts w:ascii="Arial" w:cs="Arial" w:eastAsia="Arial" w:hAnsi="Arial"/>
+                <w:b w:val="false"/>
+                <w:bCs w:val="false"/>
+                <w:sz w:val="19"/>
+                <w:szCs w:val="19"/>
+              </w:rPr>
+              <w:t xml:space="preserve">394,999</w:t>
             </w:r>
           </w:p>
         </w:tc>
@@ -7408,15 +8662,18 @@
             </w:tcMar>
           </w:tcPr>
           <w:p>
-            <w:r>
-              <w:rPr>
-                <w:rFonts w:ascii="Arial" w:cs="Arial" w:eastAsia="Arial" w:hAnsi="Arial"/>
-                <w:b w:val="false"/>
-                <w:bCs w:val="false"/>
-                <w:sz w:val="19"/>
-                <w:szCs w:val="19"/>
-              </w:rPr>
-              <w:t xml:space="preserve">376</w:t>
+            <w:pPr>
+              <w:keepNext/>
+            </w:pPr>
+            <w:r>
+              <w:rPr>
+                <w:rFonts w:ascii="Arial" w:cs="Arial" w:eastAsia="Arial" w:hAnsi="Arial"/>
+                <w:b w:val="false"/>
+                <w:bCs w:val="false"/>
+                <w:sz w:val="19"/>
+                <w:szCs w:val="19"/>
+              </w:rPr>
+              <w:t xml:space="preserve">372</w:t>
             </w:r>
           </w:p>
         </w:tc>
@@ -7437,6 +8694,9 @@
             </w:tcMar>
           </w:tcPr>
           <w:p>
+            <w:pPr>
+              <w:keepNext/>
+            </w:pPr>
             <w:r>
               <w:rPr>
                 <w:rFonts w:ascii="Arial" w:cs="Arial" w:eastAsia="Arial" w:hAnsi="Arial"/>
@@ -7471,6 +8731,9 @@
             </w:tcMar>
           </w:tcPr>
           <w:p>
+            <w:pPr>
+              <w:keepNext w:val="false"/>
+            </w:pPr>
             <w:r>
               <w:rPr>
                 <w:rFonts w:ascii="Arial" w:cs="Arial" w:eastAsia="Arial" w:hAnsi="Arial"/>
@@ -7500,15 +8763,18 @@
             </w:tcMar>
           </w:tcPr>
           <w:p>
-            <w:r>
-              <w:rPr>
-                <w:rFonts w:ascii="Arial" w:cs="Arial" w:eastAsia="Arial" w:hAnsi="Arial"/>
-                <w:b w:val="false"/>
-                <w:bCs w:val="false"/>
-                <w:sz w:val="19"/>
-                <w:szCs w:val="19"/>
-              </w:rPr>
-              <w:t xml:space="preserve">1,238</w:t>
+            <w:pPr>
+              <w:keepNext w:val="false"/>
+            </w:pPr>
+            <w:r>
+              <w:rPr>
+                <w:rFonts w:ascii="Arial" w:cs="Arial" w:eastAsia="Arial" w:hAnsi="Arial"/>
+                <w:b w:val="false"/>
+                <w:bCs w:val="false"/>
+                <w:sz w:val="19"/>
+                <w:szCs w:val="19"/>
+              </w:rPr>
+              <w:t xml:space="preserve">1,236</w:t>
             </w:r>
           </w:p>
         </w:tc>
@@ -7529,15 +8795,18 @@
             </w:tcMar>
           </w:tcPr>
           <w:p>
-            <w:r>
-              <w:rPr>
-                <w:rFonts w:ascii="Arial" w:cs="Arial" w:eastAsia="Arial" w:hAnsi="Arial"/>
-                <w:b w:val="false"/>
-                <w:bCs w:val="false"/>
-                <w:sz w:val="19"/>
-                <w:szCs w:val="19"/>
-              </w:rPr>
-              <w:t xml:space="preserve">239,012</w:t>
+            <w:pPr>
+              <w:keepNext w:val="false"/>
+            </w:pPr>
+            <w:r>
+              <w:rPr>
+                <w:rFonts w:ascii="Arial" w:cs="Arial" w:eastAsia="Arial" w:hAnsi="Arial"/>
+                <w:b w:val="false"/>
+                <w:bCs w:val="false"/>
+                <w:sz w:val="19"/>
+                <w:szCs w:val="19"/>
+              </w:rPr>
+              <w:t xml:space="preserve">234,516</w:t>
             </w:r>
           </w:p>
         </w:tc>
@@ -7558,15 +8827,18 @@
             </w:tcMar>
           </w:tcPr>
           <w:p>
-            <w:r>
-              <w:rPr>
-                <w:rFonts w:ascii="Arial" w:cs="Arial" w:eastAsia="Arial" w:hAnsi="Arial"/>
-                <w:b w:val="false"/>
-                <w:bCs w:val="false"/>
-                <w:sz w:val="19"/>
-                <w:szCs w:val="19"/>
-              </w:rPr>
-              <w:t xml:space="preserve">193</w:t>
+            <w:pPr>
+              <w:keepNext w:val="false"/>
+            </w:pPr>
+            <w:r>
+              <w:rPr>
+                <w:rFonts w:ascii="Arial" w:cs="Arial" w:eastAsia="Arial" w:hAnsi="Arial"/>
+                <w:b w:val="false"/>
+                <w:bCs w:val="false"/>
+                <w:sz w:val="19"/>
+                <w:szCs w:val="19"/>
+              </w:rPr>
+              <w:t xml:space="preserve">190</w:t>
             </w:r>
           </w:p>
         </w:tc>
@@ -7587,6 +8859,9 @@
             </w:tcMar>
           </w:tcPr>
           <w:p>
+            <w:pPr>
+              <w:keepNext w:val="false"/>
+            </w:pPr>
             <w:r>
               <w:rPr>
                 <w:rFonts w:ascii="Arial" w:cs="Arial" w:eastAsia="Arial" w:hAnsi="Arial"/>
@@ -7623,6 +8898,7 @@
     <w:p>
       <w:pPr>
         <w:pStyle w:val="Heading1"/>
+        <w:keepNext/>
         <w:spacing w:after="160" w:before="320"/>
       </w:pPr>
       <w:r>
@@ -7740,6 +9016,9 @@
             </w:tcMar>
           </w:tcPr>
           <w:p>
+            <w:pPr>
+              <w:keepNext/>
+            </w:pPr>
             <w:r>
               <w:rPr>
                 <w:rFonts w:ascii="Arial" w:cs="Arial" w:eastAsia="Arial" w:hAnsi="Arial"/>
@@ -7770,6 +9049,9 @@
             </w:tcMar>
           </w:tcPr>
           <w:p>
+            <w:pPr>
+              <w:keepNext/>
+            </w:pPr>
             <w:r>
               <w:rPr>
                 <w:rFonts w:ascii="Arial" w:cs="Arial" w:eastAsia="Arial" w:hAnsi="Arial"/>
@@ -7800,6 +9082,9 @@
             </w:tcMar>
           </w:tcPr>
           <w:p>
+            <w:pPr>
+              <w:keepNext/>
+            </w:pPr>
             <w:r>
               <w:rPr>
                 <w:rFonts w:ascii="Arial" w:cs="Arial" w:eastAsia="Arial" w:hAnsi="Arial"/>
@@ -7830,6 +9115,9 @@
             </w:tcMar>
           </w:tcPr>
           <w:p>
+            <w:pPr>
+              <w:keepNext/>
+            </w:pPr>
             <w:r>
               <w:rPr>
                 <w:rFonts w:ascii="Arial" w:cs="Arial" w:eastAsia="Arial" w:hAnsi="Arial"/>
@@ -7864,6 +9152,9 @@
             </w:tcMar>
           </w:tcPr>
           <w:p>
+            <w:pPr>
+              <w:keepNext/>
+            </w:pPr>
             <w:r>
               <w:rPr>
                 <w:rFonts w:ascii="Arial" w:cs="Arial" w:eastAsia="Arial" w:hAnsi="Arial"/>
@@ -7893,6 +9184,9 @@
             </w:tcMar>
           </w:tcPr>
           <w:p>
+            <w:pPr>
+              <w:keepNext/>
+            </w:pPr>
             <w:r>
               <w:rPr>
                 <w:rFonts w:ascii="Arial" w:cs="Arial" w:eastAsia="Arial" w:hAnsi="Arial"/>
@@ -7922,6 +9216,9 @@
             </w:tcMar>
           </w:tcPr>
           <w:p>
+            <w:pPr>
+              <w:keepNext/>
+            </w:pPr>
             <w:r>
               <w:rPr>
                 <w:rFonts w:ascii="Arial" w:cs="Arial" w:eastAsia="Arial" w:hAnsi="Arial"/>
@@ -7951,6 +9248,9 @@
             </w:tcMar>
           </w:tcPr>
           <w:p>
+            <w:pPr>
+              <w:keepNext/>
+            </w:pPr>
             <w:r>
               <w:rPr>
                 <w:rFonts w:ascii="Arial" w:cs="Arial" w:eastAsia="Arial" w:hAnsi="Arial"/>
@@ -7985,6 +9285,9 @@
             </w:tcMar>
           </w:tcPr>
           <w:p>
+            <w:pPr>
+              <w:keepNext/>
+            </w:pPr>
             <w:r>
               <w:rPr>
                 <w:rFonts w:ascii="Arial" w:cs="Arial" w:eastAsia="Arial" w:hAnsi="Arial"/>
@@ -8014,6 +9317,9 @@
             </w:tcMar>
           </w:tcPr>
           <w:p>
+            <w:pPr>
+              <w:keepNext/>
+            </w:pPr>
             <w:r>
               <w:rPr>
                 <w:rFonts w:ascii="Arial" w:cs="Arial" w:eastAsia="Arial" w:hAnsi="Arial"/>
@@ -8043,6 +9349,9 @@
             </w:tcMar>
           </w:tcPr>
           <w:p>
+            <w:pPr>
+              <w:keepNext/>
+            </w:pPr>
             <w:r>
               <w:rPr>
                 <w:rFonts w:ascii="Arial" w:cs="Arial" w:eastAsia="Arial" w:hAnsi="Arial"/>
@@ -8072,6 +9381,9 @@
             </w:tcMar>
           </w:tcPr>
           <w:p>
+            <w:pPr>
+              <w:keepNext/>
+            </w:pPr>
             <w:r>
               <w:rPr>
                 <w:rFonts w:ascii="Arial" w:cs="Arial" w:eastAsia="Arial" w:hAnsi="Arial"/>
@@ -8106,6 +9418,9 @@
             </w:tcMar>
           </w:tcPr>
           <w:p>
+            <w:pPr>
+              <w:keepNext/>
+            </w:pPr>
             <w:r>
               <w:rPr>
                 <w:rFonts w:ascii="Arial" w:cs="Arial" w:eastAsia="Arial" w:hAnsi="Arial"/>
@@ -8135,6 +9450,9 @@
             </w:tcMar>
           </w:tcPr>
           <w:p>
+            <w:pPr>
+              <w:keepNext/>
+            </w:pPr>
             <w:r>
               <w:rPr>
                 <w:rFonts w:ascii="Arial" w:cs="Arial" w:eastAsia="Arial" w:hAnsi="Arial"/>
@@ -8164,6 +9482,9 @@
             </w:tcMar>
           </w:tcPr>
           <w:p>
+            <w:pPr>
+              <w:keepNext/>
+            </w:pPr>
             <w:r>
               <w:rPr>
                 <w:rFonts w:ascii="Arial" w:cs="Arial" w:eastAsia="Arial" w:hAnsi="Arial"/>
@@ -8193,6 +9514,9 @@
             </w:tcMar>
           </w:tcPr>
           <w:p>
+            <w:pPr>
+              <w:keepNext/>
+            </w:pPr>
             <w:r>
               <w:rPr>
                 <w:rFonts w:ascii="Arial" w:cs="Arial" w:eastAsia="Arial" w:hAnsi="Arial"/>
@@ -8227,6 +9551,9 @@
             </w:tcMar>
           </w:tcPr>
           <w:p>
+            <w:pPr>
+              <w:keepNext w:val="false"/>
+            </w:pPr>
             <w:r>
               <w:rPr>
                 <w:rFonts w:ascii="Arial" w:cs="Arial" w:eastAsia="Arial" w:hAnsi="Arial"/>
@@ -8256,6 +9583,9 @@
             </w:tcMar>
           </w:tcPr>
           <w:p>
+            <w:pPr>
+              <w:keepNext w:val="false"/>
+            </w:pPr>
             <w:r>
               <w:rPr>
                 <w:rFonts w:ascii="Arial" w:cs="Arial" w:eastAsia="Arial" w:hAnsi="Arial"/>
@@ -8285,6 +9615,9 @@
             </w:tcMar>
           </w:tcPr>
           <w:p>
+            <w:pPr>
+              <w:keepNext w:val="false"/>
+            </w:pPr>
             <w:r>
               <w:rPr>
                 <w:rFonts w:ascii="Arial" w:cs="Arial" w:eastAsia="Arial" w:hAnsi="Arial"/>
@@ -8314,6 +9647,9 @@
             </w:tcMar>
           </w:tcPr>
           <w:p>
+            <w:pPr>
+              <w:keepNext w:val="false"/>
+            </w:pPr>
             <w:r>
               <w:rPr>
                 <w:rFonts w:ascii="Arial" w:cs="Arial" w:eastAsia="Arial" w:hAnsi="Arial"/>
@@ -8369,6 +9705,7 @@
     <w:p>
       <w:pPr>
         <w:pStyle w:val="Heading1"/>
+        <w:keepNext/>
         <w:spacing w:after="160" w:before="320"/>
       </w:pPr>
       <w:r>
@@ -8508,6 +9845,7 @@
     <w:p>
       <w:pPr>
         <w:pStyle w:val="Heading1"/>
+        <w:keepNext/>
         <w:spacing w:after="160" w:before="320"/>
       </w:pPr>
       <w:r>
@@ -8537,7 +9875,7 @@
           <w:sz w:val="21"/>
           <w:szCs w:val="21"/>
         </w:rPr>
-        <w:t xml:space="preserve">Both datasets are synthetic. The supplied 500-row file has a deterministic structure (total_spend = frequency × recency_days), a random segment label and inconsistent dates. The 30,318-transaction dataset was simulated from the BG/NBD and Gamma-Gamma assumptions. Results therefore show that the methods are implemented and validated correctly, not how they would perform on a real retailer.</w:t>
+        <w:t xml:space="preserve">Both datasets are synthetic. The supplied 500-row file has a deterministic structure (total_spend = frequency × recency_days), a random segment label and inconsistent dates. The transaction dataset was simulated from the BG/NBD and Gamma-Gamma assumptions, including the anomalies, so the anomaly-detection scores are optimistic. Results therefore show that the methods are implemented and validated correctly, not how they would perform on a real retailer.</w:t>
       </w:r>
     </w:p>
     <w:p>
@@ -8555,7 +9893,7 @@
           <w:sz w:val="21"/>
           <w:szCs w:val="21"/>
         </w:rPr>
-        <w:t xml:space="preserve">Model assumptions were not tested against reality. BG/NBD assumes constant purchase rates and that customers leave permanently; Gamma-Gamma assumes order value is independent of frequency. These hold in the simulated data (correlation -0.007) but would have to be checked on real data, along with effects such as seasonality and promotions.</w:t>
+        <w:t xml:space="preserve">Model assumptions were not tested against reality. BG/NBD assumes constant purchase rates and that customers leave permanently; Gamma-Gamma assumes order value is independent of frequency. These hold in the simulated data (correlation -0.006) but would have to be checked on real data, along with effects such as seasonality and promotions.</w:t>
       </w:r>
     </w:p>
     <w:p>
@@ -8633,6 +9971,7 @@
     <w:p>
       <w:pPr>
         <w:pStyle w:val="Heading1"/>
+        <w:keepNext/>
         <w:spacing w:after="160" w:before="320"/>
       </w:pPr>
       <w:r>
@@ -8658,7 +9997,7 @@
           <w:sz w:val="21"/>
           <w:szCs w:val="21"/>
         </w:rPr>
-        <w:t xml:space="preserve">This project delivered a complete CLV solution in two parts. First, an audit of the supplied 500-customer file showed that its headline regression accuracy (R² 0.947 on log-CLV) comes from a formula embedded in synthetic data, and that its segment label carries no information. Second, following the brief’s method, a 5,000-customer, 30,318-transaction dataset was generated and BG/NBD with Gamma-Gamma was fitted and validated on a held-out final year. It predicted total repeat purchases within 3.3% and average order value within 3.1%, and ranked customers so that the top 10% captured 50.4% of next-year spend, slightly better than gradient boosting on RFM features (47.3%). Combining the active probability with 12-month CLV produced five retention actions, with the top 5% of customers holding 42.5% of predicted value.</w:t>
+        <w:t xml:space="preserve">This project delivered a complete CLV solution in two parts. First, an audit of the supplied 500-customer file showed that its headline regression accuracy (R² 0.947 on log-CLV) comes from a formula embedded in synthetic data, and that its segment label carries no information. Second, following the brief’s method, a transaction dataset of 5,000 customers and 31,256 rows (3% labelled anomalies, all detected and removed) was generated, and BG/NBD with Gamma-Gamma was fitted and validated on a held-out final year. It predicted total repeat purchases within 3.2% and average order value within 2.5%, and ranked customers so that the top 10% captured 52.2% of next-year spend, better than gradient boosting on RFM features (47.1%). Combining the active probability with 12-month CLV produced five retention actions, with the top 5% of customers holding 42.4% of predicted value. Experiments are tracked in MLflow.</w:t>
       </w:r>
     </w:p>
     <w:p>
@@ -8726,7 +10065,7 @@
           <w:sz w:val="21"/>
           <w:szCs w:val="21"/>
         </w:rPr>
-        <w:t xml:space="preserve">Track the models in MLflow, as listed in the brief’s technology stack.</w:t>
+        <w:t xml:space="preserve">Test the retention actions with a controlled campaign and measure the uplift.</w:t>
       </w:r>
     </w:p>
     <w:p>
@@ -8744,30 +10083,13 @@
           <w:sz w:val="21"/>
           <w:szCs w:val="21"/>
         </w:rPr>
-        <w:t xml:space="preserve">Test the retention actions with a controlled campaign and measure the uplift.</w:t>
-      </w:r>
-    </w:p>
-    <w:p>
-      <w:pPr>
-        <w:pStyle w:val="ListParagraph"/>
-        <w:numPr>
-          <w:ilvl w:val="0"/>
-          <w:numId w:val="2"/>
-        </w:numPr>
-        <w:spacing w:after="80" w:line="290"/>
-      </w:pPr>
-      <w:r>
-        <w:rPr>
-          <w:rFonts w:ascii="Arial" w:cs="Arial" w:eastAsia="Arial" w:hAnsi="Arial"/>
-          <w:sz w:val="21"/>
-          <w:szCs w:val="21"/>
-        </w:rPr>
         <w:t xml:space="preserve">Where lawful, add demographic checks to confirm that segments and spend allocation are fair.</w:t>
       </w:r>
     </w:p>
     <w:p>
       <w:pPr>
         <w:pStyle w:val="Heading1"/>
+        <w:keepNext/>
         <w:spacing w:after="160" w:before="320"/>
       </w:pPr>
       <w:r>
@@ -8792,7 +10114,7 @@
           <w:sz w:val="20"/>
           <w:szCs w:val="20"/>
         </w:rPr>
-        <w:t xml:space="preserve">[1] Fader, P. S., Hardie, B. G. S. and Lee, K. L. (2005). “Counting Your Customers the Easy Way: An Alternative to the Pareto/NBD Model.” Marketing Science, 24(2), 275–284.</w:t>
+        <w:t xml:space="preserve">[1] Fader, P. S., Hardie, B. G. S. and Lee, K. L. (2005). “Counting Your Customers the Easy Way: An Alternative to the Pareto/NBD Model.” Marketing Science, 24(2), 275–284. doi:10.1287/mksc.1040.0098</w:t>
       </w:r>
     </w:p>
     <w:p>
@@ -8805,7 +10127,7 @@
           <w:sz w:val="20"/>
           <w:szCs w:val="20"/>
         </w:rPr>
-        <w:t xml:space="preserve">[2] Fader, P. S. and Hardie, B. G. S. (2013). “The Gamma-Gamma Model of Monetary Value.” Technical note.</w:t>
+        <w:t xml:space="preserve">[2] Fader, P. S. and Hardie, B. G. S. (2013). “The Gamma-Gamma Model of Monetary Value.” Technical note, brucehardie.com/notes/025.</w:t>
       </w:r>
     </w:p>
     <w:p>
@@ -8831,7 +10153,7 @@
           <w:sz w:val="20"/>
           <w:szCs w:val="20"/>
         </w:rPr>
-        <w:t xml:space="preserve">[4] Pedregosa, F. et al. (2011). “Scikit-learn: Machine Learning in Python.” Journal of Machine Learning Research, 12, 2825–2830.</w:t>
+        <w:t xml:space="preserve">[4] Pedregosa, F. et al. (2011). “Scikit-learn: Machine Learning in Python.” Journal of Machine Learning Research, 12, 2825–2830. jmlr.org/papers/v12/pedregosa11a.html</w:t>
       </w:r>
     </w:p>
     <w:p>
@@ -8844,7 +10166,7 @@
           <w:sz w:val="20"/>
           <w:szCs w:val="20"/>
         </w:rPr>
-        <w:t xml:space="preserve">[5] Government of India (2023). The Digital Personal Data Protection Act, 2023.</w:t>
+        <w:t xml:space="preserve">[5] Government of India (2023). The Digital Personal Data Protection Act, 2023 (Act No. 22 of 2023). indiacode.nic.in.</w:t>
       </w:r>
     </w:p>
     <w:p>
@@ -8863,6 +10185,7 @@
     <w:p>
       <w:pPr>
         <w:pStyle w:val="Heading1"/>
+        <w:keepNext/>
         <w:spacing w:after="160" w:before="320"/>
       </w:pPr>
       <w:r>
@@ -8894,6 +10217,7 @@
     <w:p>
       <w:pPr>
         <w:pStyle w:val="Heading1"/>
+        <w:keepNext/>
         <w:spacing w:after="160" w:before="320"/>
       </w:pPr>
       <w:r>
@@ -8946,6 +10270,9 @@
             </w:tcMar>
           </w:tcPr>
           <w:p>
+            <w:pPr>
+              <w:keepNext/>
+            </w:pPr>
             <w:r>
               <w:rPr>
                 <w:rFonts w:ascii="Arial" w:cs="Arial" w:eastAsia="Arial" w:hAnsi="Arial"/>
@@ -8976,6 +10303,9 @@
             </w:tcMar>
           </w:tcPr>
           <w:p>
+            <w:pPr>
+              <w:keepNext/>
+            </w:pPr>
             <w:r>
               <w:rPr>
                 <w:rFonts w:ascii="Arial" w:cs="Arial" w:eastAsia="Arial" w:hAnsi="Arial"/>
@@ -9010,6 +10340,9 @@
             </w:tcMar>
           </w:tcPr>
           <w:p>
+            <w:pPr>
+              <w:keepNext/>
+            </w:pPr>
             <w:r>
               <w:rPr>
                 <w:rFonts w:ascii="Arial" w:cs="Arial" w:eastAsia="Arial" w:hAnsi="Arial"/>
@@ -9039,6 +10372,9 @@
             </w:tcMar>
           </w:tcPr>
           <w:p>
+            <w:pPr>
+              <w:keepNext/>
+            </w:pPr>
             <w:r>
               <w:rPr>
                 <w:rFonts w:ascii="Arial" w:cs="Arial" w:eastAsia="Arial" w:hAnsi="Arial"/>
@@ -9073,6 +10409,9 @@
             </w:tcMar>
           </w:tcPr>
           <w:p>
+            <w:pPr>
+              <w:keepNext/>
+            </w:pPr>
             <w:r>
               <w:rPr>
                 <w:rFonts w:ascii="Arial" w:cs="Arial" w:eastAsia="Arial" w:hAnsi="Arial"/>
@@ -9102,6 +10441,9 @@
             </w:tcMar>
           </w:tcPr>
           <w:p>
+            <w:pPr>
+              <w:keepNext/>
+            </w:pPr>
             <w:r>
               <w:rPr>
                 <w:rFonts w:ascii="Arial" w:cs="Arial" w:eastAsia="Arial" w:hAnsi="Arial"/>
@@ -9136,6 +10478,9 @@
             </w:tcMar>
           </w:tcPr>
           <w:p>
+            <w:pPr>
+              <w:keepNext/>
+            </w:pPr>
             <w:r>
               <w:rPr>
                 <w:rFonts w:ascii="Arial" w:cs="Arial" w:eastAsia="Arial" w:hAnsi="Arial"/>
@@ -9165,15 +10510,18 @@
             </w:tcMar>
           </w:tcPr>
           <w:p>
-            <w:r>
-              <w:rPr>
-                <w:rFonts w:ascii="Arial" w:cs="Arial" w:eastAsia="Arial" w:hAnsi="Arial"/>
-                <w:b w:val="false"/>
-                <w:bCs w:val="false"/>
-                <w:sz w:val="19"/>
-                <w:szCs w:val="19"/>
-              </w:rPr>
-              <w:t xml:space="preserve">30,318 simulated transactions for 5,000 customers</w:t>
+            <w:pPr>
+              <w:keepNext/>
+            </w:pPr>
+            <w:r>
+              <w:rPr>
+                <w:rFonts w:ascii="Arial" w:cs="Arial" w:eastAsia="Arial" w:hAnsi="Arial"/>
+                <w:b w:val="false"/>
+                <w:bCs w:val="false"/>
+                <w:sz w:val="19"/>
+                <w:szCs w:val="19"/>
+              </w:rPr>
+              <w:t xml:space="preserve">31,256 simulated transactions (5,000 customers) with is_anomaly and anomaly_detected labels</w:t>
             </w:r>
           </w:p>
         </w:tc>
@@ -9199,15 +10547,18 @@
             </w:tcMar>
           </w:tcPr>
           <w:p>
-            <w:r>
-              <w:rPr>
-                <w:rFonts w:ascii="Arial" w:cs="Arial" w:eastAsia="Arial" w:hAnsi="Arial"/>
-                <w:b w:val="false"/>
-                <w:bCs w:val="false"/>
-                <w:sz w:val="19"/>
-                <w:szCs w:val="19"/>
-              </w:rPr>
-              <w:t xml:space="preserve">customer_clv_bgnbd.csv</w:t>
+            <w:pPr>
+              <w:keepNext/>
+            </w:pPr>
+            <w:r>
+              <w:rPr>
+                <w:rFonts w:ascii="Arial" w:cs="Arial" w:eastAsia="Arial" w:hAnsi="Arial"/>
+                <w:b w:val="false"/>
+                <w:bCs w:val="false"/>
+                <w:sz w:val="19"/>
+                <w:szCs w:val="19"/>
+              </w:rPr>
+              <w:t xml:space="preserve">anomaly_detection_metrics.csv</w:t>
             </w:r>
           </w:p>
         </w:tc>
@@ -9228,15 +10579,18 @@
             </w:tcMar>
           </w:tcPr>
           <w:p>
-            <w:r>
-              <w:rPr>
-                <w:rFonts w:ascii="Arial" w:cs="Arial" w:eastAsia="Arial" w:hAnsi="Arial"/>
-                <w:b w:val="false"/>
-                <w:bCs w:val="false"/>
-                <w:sz w:val="19"/>
-                <w:szCs w:val="19"/>
-              </w:rPr>
-              <w:t xml:space="preserve">Per-customer P(alive), expected purchases, 12-month CLV, action</w:t>
+            <w:pPr>
+              <w:keepNext/>
+            </w:pPr>
+            <w:r>
+              <w:rPr>
+                <w:rFonts w:ascii="Arial" w:cs="Arial" w:eastAsia="Arial" w:hAnsi="Arial"/>
+                <w:b w:val="false"/>
+                <w:bCs w:val="false"/>
+                <w:sz w:val="19"/>
+                <w:szCs w:val="19"/>
+              </w:rPr>
+              <w:t xml:space="preserve">Anomaly detection precision and recall</w:t>
             </w:r>
           </w:p>
         </w:tc>
@@ -9262,15 +10616,18 @@
             </w:tcMar>
           </w:tcPr>
           <w:p>
-            <w:r>
-              <w:rPr>
-                <w:rFonts w:ascii="Arial" w:cs="Arial" w:eastAsia="Arial" w:hAnsi="Arial"/>
-                <w:b w:val="false"/>
-                <w:bCs w:val="false"/>
-                <w:sz w:val="19"/>
-                <w:szCs w:val="19"/>
-              </w:rPr>
-              <w:t xml:space="preserve">bgnbd_metrics.csv, bgnbd_vs_ml.csv, bgnbd_action_summary.csv</w:t>
+            <w:pPr>
+              <w:keepNext/>
+            </w:pPr>
+            <w:r>
+              <w:rPr>
+                <w:rFonts w:ascii="Arial" w:cs="Arial" w:eastAsia="Arial" w:hAnsi="Arial"/>
+                <w:b w:val="false"/>
+                <w:bCs w:val="false"/>
+                <w:sz w:val="19"/>
+                <w:szCs w:val="19"/>
+              </w:rPr>
+              <w:t xml:space="preserve">data_dictionary_transactions.csv</w:t>
             </w:r>
           </w:p>
         </w:tc>
@@ -9291,15 +10648,18 @@
             </w:tcMar>
           </w:tcPr>
           <w:p>
-            <w:r>
-              <w:rPr>
-                <w:rFonts w:ascii="Arial" w:cs="Arial" w:eastAsia="Arial" w:hAnsi="Arial"/>
-                <w:b w:val="false"/>
-                <w:bCs w:val="false"/>
-                <w:sz w:val="19"/>
-                <w:szCs w:val="19"/>
-              </w:rPr>
-              <w:t xml:space="preserve">BG/NBD results and comparisons</w:t>
+            <w:pPr>
+              <w:keepNext/>
+            </w:pPr>
+            <w:r>
+              <w:rPr>
+                <w:rFonts w:ascii="Arial" w:cs="Arial" w:eastAsia="Arial" w:hAnsi="Arial"/>
+                <w:b w:val="false"/>
+                <w:bCs w:val="false"/>
+                <w:sz w:val="19"/>
+                <w:szCs w:val="19"/>
+              </w:rPr>
+              <w:t xml:space="preserve">Column descriptions for transactions.csv and customer_clv_bgnbd.csv</w:t>
             </w:r>
           </w:p>
         </w:tc>
@@ -9325,15 +10685,18 @@
             </w:tcMar>
           </w:tcPr>
           <w:p>
-            <w:r>
-              <w:rPr>
-                <w:rFonts w:ascii="Arial" w:cs="Arial" w:eastAsia="Arial" w:hAnsi="Arial"/>
-                <w:b w:val="false"/>
-                <w:bCs w:val="false"/>
-                <w:sz w:val="19"/>
-                <w:szCs w:val="19"/>
-              </w:rPr>
-              <w:t xml:space="preserve">dataset.csv</w:t>
+            <w:pPr>
+              <w:keepNext/>
+            </w:pPr>
+            <w:r>
+              <w:rPr>
+                <w:rFonts w:ascii="Arial" w:cs="Arial" w:eastAsia="Arial" w:hAnsi="Arial"/>
+                <w:b w:val="false"/>
+                <w:bCs w:val="false"/>
+                <w:sz w:val="19"/>
+                <w:szCs w:val="19"/>
+              </w:rPr>
+              <w:t xml:space="preserve">mlflow.db, mlruns/</w:t>
             </w:r>
           </w:p>
         </w:tc>
@@ -9354,15 +10717,18 @@
             </w:tcMar>
           </w:tcPr>
           <w:p>
-            <w:r>
-              <w:rPr>
-                <w:rFonts w:ascii="Arial" w:cs="Arial" w:eastAsia="Arial" w:hAnsi="Arial"/>
-                <w:b w:val="false"/>
-                <w:bCs w:val="false"/>
-                <w:sz w:val="19"/>
-                <w:szCs w:val="19"/>
-              </w:rPr>
-              <w:t xml:space="preserve">Original dataset (500 rows)</w:t>
+            <w:pPr>
+              <w:keepNext/>
+            </w:pPr>
+            <w:r>
+              <w:rPr>
+                <w:rFonts w:ascii="Arial" w:cs="Arial" w:eastAsia="Arial" w:hAnsi="Arial"/>
+                <w:b w:val="false"/>
+                <w:bCs w:val="false"/>
+                <w:sz w:val="19"/>
+                <w:szCs w:val="19"/>
+              </w:rPr>
+              <w:t xml:space="preserve">MLflow experiment tracking (view with: mlflow ui --backend-store-uri sqlite:///mlflow.db)</w:t>
             </w:r>
           </w:p>
         </w:tc>
@@ -9388,15 +10754,18 @@
             </w:tcMar>
           </w:tcPr>
           <w:p>
-            <w:r>
-              <w:rPr>
-                <w:rFonts w:ascii="Arial" w:cs="Arial" w:eastAsia="Arial" w:hAnsi="Arial"/>
-                <w:b w:val="false"/>
-                <w:bCs w:val="false"/>
-                <w:sz w:val="19"/>
-                <w:szCs w:val="19"/>
-              </w:rPr>
-              <w:t xml:space="preserve">dataset_clean.csv</w:t>
+            <w:pPr>
+              <w:keepNext/>
+            </w:pPr>
+            <w:r>
+              <w:rPr>
+                <w:rFonts w:ascii="Arial" w:cs="Arial" w:eastAsia="Arial" w:hAnsi="Arial"/>
+                <w:b w:val="false"/>
+                <w:bCs w:val="false"/>
+                <w:sz w:val="19"/>
+                <w:szCs w:val="19"/>
+              </w:rPr>
+              <w:t xml:space="preserve">customer_clv_bgnbd.csv</w:t>
             </w:r>
           </w:p>
         </w:tc>
@@ -9417,15 +10786,18 @@
             </w:tcMar>
           </w:tcPr>
           <w:p>
-            <w:r>
-              <w:rPr>
-                <w:rFonts w:ascii="Arial" w:cs="Arial" w:eastAsia="Arial" w:hAnsi="Arial"/>
-                <w:b w:val="false"/>
-                <w:bCs w:val="false"/>
-                <w:sz w:val="19"/>
-                <w:szCs w:val="19"/>
-              </w:rPr>
-              <w:t xml:space="preserve">Cleaned data with RFM score, value tier, action, CV prediction</w:t>
+            <w:pPr>
+              <w:keepNext/>
+            </w:pPr>
+            <w:r>
+              <w:rPr>
+                <w:rFonts w:ascii="Arial" w:cs="Arial" w:eastAsia="Arial" w:hAnsi="Arial"/>
+                <w:b w:val="false"/>
+                <w:bCs w:val="false"/>
+                <w:sz w:val="19"/>
+                <w:szCs w:val="19"/>
+              </w:rPr>
+              <w:t xml:space="preserve">Per-customer P(alive), expected purchases, 12-month CLV, action</w:t>
             </w:r>
           </w:p>
         </w:tc>
@@ -9451,15 +10823,18 @@
             </w:tcMar>
           </w:tcPr>
           <w:p>
-            <w:r>
-              <w:rPr>
-                <w:rFonts w:ascii="Arial" w:cs="Arial" w:eastAsia="Arial" w:hAnsi="Arial"/>
-                <w:b w:val="false"/>
-                <w:bCs w:val="false"/>
-                <w:sz w:val="19"/>
-                <w:szCs w:val="19"/>
-              </w:rPr>
-              <w:t xml:space="preserve">data_dictionary.csv</w:t>
+            <w:pPr>
+              <w:keepNext/>
+            </w:pPr>
+            <w:r>
+              <w:rPr>
+                <w:rFonts w:ascii="Arial" w:cs="Arial" w:eastAsia="Arial" w:hAnsi="Arial"/>
+                <w:b w:val="false"/>
+                <w:bCs w:val="false"/>
+                <w:sz w:val="19"/>
+                <w:szCs w:val="19"/>
+              </w:rPr>
+              <w:t xml:space="preserve">bgnbd_metrics.csv, bgnbd_vs_ml.csv, bgnbd_action_summary.csv</w:t>
             </w:r>
           </w:p>
         </w:tc>
@@ -9480,15 +10855,18 @@
             </w:tcMar>
           </w:tcPr>
           <w:p>
-            <w:r>
-              <w:rPr>
-                <w:rFonts w:ascii="Arial" w:cs="Arial" w:eastAsia="Arial" w:hAnsi="Arial"/>
-                <w:b w:val="false"/>
-                <w:bCs w:val="false"/>
-                <w:sz w:val="19"/>
-                <w:szCs w:val="19"/>
-              </w:rPr>
-              <w:t xml:space="preserve">All columns described</w:t>
+            <w:pPr>
+              <w:keepNext/>
+            </w:pPr>
+            <w:r>
+              <w:rPr>
+                <w:rFonts w:ascii="Arial" w:cs="Arial" w:eastAsia="Arial" w:hAnsi="Arial"/>
+                <w:b w:val="false"/>
+                <w:bCs w:val="false"/>
+                <w:sz w:val="19"/>
+                <w:szCs w:val="19"/>
+              </w:rPr>
+              <w:t xml:space="preserve">BG/NBD results and comparisons</w:t>
             </w:r>
           </w:p>
         </w:tc>
@@ -9514,15 +10892,18 @@
             </w:tcMar>
           </w:tcPr>
           <w:p>
-            <w:r>
-              <w:rPr>
-                <w:rFonts w:ascii="Arial" w:cs="Arial" w:eastAsia="Arial" w:hAnsi="Arial"/>
-                <w:b w:val="false"/>
-                <w:bCs w:val="false"/>
-                <w:sz w:val="19"/>
-                <w:szCs w:val="19"/>
-              </w:rPr>
-              <w:t xml:space="preserve">model_metrics.csv</w:t>
+            <w:pPr>
+              <w:keepNext/>
+            </w:pPr>
+            <w:r>
+              <w:rPr>
+                <w:rFonts w:ascii="Arial" w:cs="Arial" w:eastAsia="Arial" w:hAnsi="Arial"/>
+                <w:b w:val="false"/>
+                <w:bCs w:val="false"/>
+                <w:sz w:val="19"/>
+                <w:szCs w:val="19"/>
+              </w:rPr>
+              <w:t xml:space="preserve">dataset.csv</w:t>
             </w:r>
           </w:p>
         </w:tc>
@@ -9543,15 +10924,18 @@
             </w:tcMar>
           </w:tcPr>
           <w:p>
-            <w:r>
-              <w:rPr>
-                <w:rFonts w:ascii="Arial" w:cs="Arial" w:eastAsia="Arial" w:hAnsi="Arial"/>
-                <w:b w:val="false"/>
-                <w:bCs w:val="false"/>
-                <w:sz w:val="19"/>
-                <w:szCs w:val="19"/>
-              </w:rPr>
-              <w:t xml:space="preserve">Cross-validated model results</w:t>
+            <w:pPr>
+              <w:keepNext/>
+            </w:pPr>
+            <w:r>
+              <w:rPr>
+                <w:rFonts w:ascii="Arial" w:cs="Arial" w:eastAsia="Arial" w:hAnsi="Arial"/>
+                <w:b w:val="false"/>
+                <w:bCs w:val="false"/>
+                <w:sz w:val="19"/>
+                <w:szCs w:val="19"/>
+              </w:rPr>
+              <w:t xml:space="preserve">Original dataset (500 rows)</w:t>
             </w:r>
           </w:p>
         </w:tc>
@@ -9577,15 +10961,18 @@
             </w:tcMar>
           </w:tcPr>
           <w:p>
-            <w:r>
-              <w:rPr>
-                <w:rFonts w:ascii="Arial" w:cs="Arial" w:eastAsia="Arial" w:hAnsi="Arial"/>
-                <w:b w:val="false"/>
-                <w:bCs w:val="false"/>
-                <w:sz w:val="19"/>
-                <w:szCs w:val="19"/>
-              </w:rPr>
-              <w:t xml:space="preserve">data_quality_audit.csv</w:t>
+            <w:pPr>
+              <w:keepNext/>
+            </w:pPr>
+            <w:r>
+              <w:rPr>
+                <w:rFonts w:ascii="Arial" w:cs="Arial" w:eastAsia="Arial" w:hAnsi="Arial"/>
+                <w:b w:val="false"/>
+                <w:bCs w:val="false"/>
+                <w:sz w:val="19"/>
+                <w:szCs w:val="19"/>
+              </w:rPr>
+              <w:t xml:space="preserve">dataset_clean.csv</w:t>
             </w:r>
           </w:p>
         </w:tc>
@@ -9606,15 +10993,18 @@
             </w:tcMar>
           </w:tcPr>
           <w:p>
-            <w:r>
-              <w:rPr>
-                <w:rFonts w:ascii="Arial" w:cs="Arial" w:eastAsia="Arial" w:hAnsi="Arial"/>
-                <w:b w:val="false"/>
-                <w:bCs w:val="false"/>
-                <w:sz w:val="19"/>
-                <w:szCs w:val="19"/>
-              </w:rPr>
-              <w:t xml:space="preserve">Audit results</w:t>
+            <w:pPr>
+              <w:keepNext/>
+            </w:pPr>
+            <w:r>
+              <w:rPr>
+                <w:rFonts w:ascii="Arial" w:cs="Arial" w:eastAsia="Arial" w:hAnsi="Arial"/>
+                <w:b w:val="false"/>
+                <w:bCs w:val="false"/>
+                <w:sz w:val="19"/>
+                <w:szCs w:val="19"/>
+              </w:rPr>
+              <w:t xml:space="preserve">Cleaned data with RFM score, value tier, action, CV prediction</w:t>
             </w:r>
           </w:p>
         </w:tc>
@@ -9640,15 +11030,18 @@
             </w:tcMar>
           </w:tcPr>
           <w:p>
-            <w:r>
-              <w:rPr>
-                <w:rFonts w:ascii="Arial" w:cs="Arial" w:eastAsia="Arial" w:hAnsi="Arial"/>
-                <w:b w:val="false"/>
-                <w:bCs w:val="false"/>
-                <w:sz w:val="19"/>
-                <w:szCs w:val="19"/>
-              </w:rPr>
-              <w:t xml:space="preserve">segment_summary.csv</w:t>
+            <w:pPr>
+              <w:keepNext/>
+            </w:pPr>
+            <w:r>
+              <w:rPr>
+                <w:rFonts w:ascii="Arial" w:cs="Arial" w:eastAsia="Arial" w:hAnsi="Arial"/>
+                <w:b w:val="false"/>
+                <w:bCs w:val="false"/>
+                <w:sz w:val="19"/>
+                <w:szCs w:val="19"/>
+              </w:rPr>
+              <w:t xml:space="preserve">data_dictionary.csv</w:t>
             </w:r>
           </w:p>
         </w:tc>
@@ -9669,15 +11062,18 @@
             </w:tcMar>
           </w:tcPr>
           <w:p>
-            <w:r>
-              <w:rPr>
-                <w:rFonts w:ascii="Arial" w:cs="Arial" w:eastAsia="Arial" w:hAnsi="Arial"/>
-                <w:b w:val="false"/>
-                <w:bCs w:val="false"/>
-                <w:sz w:val="19"/>
-                <w:szCs w:val="19"/>
-              </w:rPr>
-              <w:t xml:space="preserve">Customers and CLV per recommended action</w:t>
+            <w:pPr>
+              <w:keepNext/>
+            </w:pPr>
+            <w:r>
+              <w:rPr>
+                <w:rFonts w:ascii="Arial" w:cs="Arial" w:eastAsia="Arial" w:hAnsi="Arial"/>
+                <w:b w:val="false"/>
+                <w:bCs w:val="false"/>
+                <w:sz w:val="19"/>
+                <w:szCs w:val="19"/>
+              </w:rPr>
+              <w:t xml:space="preserve">All columns described</w:t>
             </w:r>
           </w:p>
         </w:tc>
@@ -9703,6 +11099,216 @@
             </w:tcMar>
           </w:tcPr>
           <w:p>
+            <w:pPr>
+              <w:keepNext/>
+            </w:pPr>
+            <w:r>
+              <w:rPr>
+                <w:rFonts w:ascii="Arial" w:cs="Arial" w:eastAsia="Arial" w:hAnsi="Arial"/>
+                <w:b w:val="false"/>
+                <w:bCs w:val="false"/>
+                <w:sz w:val="19"/>
+                <w:szCs w:val="19"/>
+              </w:rPr>
+              <w:t xml:space="preserve">model_metrics.csv</w:t>
+            </w:r>
+          </w:p>
+        </w:tc>
+        <w:tc>
+          <w:tcPr>
+            <w:tcW w:type="dxa" w:w="6000"/>
+            <w:tcBorders>
+              <w:top w:val="single" w:color="BBBBBB" w:sz="4"/>
+              <w:left w:val="single" w:color="BBBBBB" w:sz="4"/>
+              <w:bottom w:val="single" w:color="BBBBBB" w:sz="4"/>
+              <w:right w:val="single" w:color="BBBBBB" w:sz="4"/>
+            </w:tcBorders>
+            <w:tcMar>
+              <w:top w:type="dxa" w:w="60"/>
+              <w:left w:type="dxa" w:w="100"/>
+              <w:bottom w:type="dxa" w:w="60"/>
+              <w:right w:type="dxa" w:w="100"/>
+            </w:tcMar>
+          </w:tcPr>
+          <w:p>
+            <w:pPr>
+              <w:keepNext/>
+            </w:pPr>
+            <w:r>
+              <w:rPr>
+                <w:rFonts w:ascii="Arial" w:cs="Arial" w:eastAsia="Arial" w:hAnsi="Arial"/>
+                <w:b w:val="false"/>
+                <w:bCs w:val="false"/>
+                <w:sz w:val="19"/>
+                <w:szCs w:val="19"/>
+              </w:rPr>
+              <w:t xml:space="preserve">Cross-validated model results</w:t>
+            </w:r>
+          </w:p>
+        </w:tc>
+      </w:tr>
+      <w:tr>
+        <w:trPr>
+          <w:tblHeader w:val="off"/>
+        </w:trPr>
+        <w:tc>
+          <w:tcPr>
+            <w:tcW w:type="dxa" w:w="3000"/>
+            <w:tcBorders>
+              <w:top w:val="single" w:color="BBBBBB" w:sz="4"/>
+              <w:left w:val="single" w:color="BBBBBB" w:sz="4"/>
+              <w:bottom w:val="single" w:color="BBBBBB" w:sz="4"/>
+              <w:right w:val="single" w:color="BBBBBB" w:sz="4"/>
+            </w:tcBorders>
+            <w:tcMar>
+              <w:top w:type="dxa" w:w="60"/>
+              <w:left w:type="dxa" w:w="100"/>
+              <w:bottom w:type="dxa" w:w="60"/>
+              <w:right w:type="dxa" w:w="100"/>
+            </w:tcMar>
+          </w:tcPr>
+          <w:p>
+            <w:pPr>
+              <w:keepNext/>
+            </w:pPr>
+            <w:r>
+              <w:rPr>
+                <w:rFonts w:ascii="Arial" w:cs="Arial" w:eastAsia="Arial" w:hAnsi="Arial"/>
+                <w:b w:val="false"/>
+                <w:bCs w:val="false"/>
+                <w:sz w:val="19"/>
+                <w:szCs w:val="19"/>
+              </w:rPr>
+              <w:t xml:space="preserve">data_quality_audit.csv</w:t>
+            </w:r>
+          </w:p>
+        </w:tc>
+        <w:tc>
+          <w:tcPr>
+            <w:tcW w:type="dxa" w:w="6000"/>
+            <w:tcBorders>
+              <w:top w:val="single" w:color="BBBBBB" w:sz="4"/>
+              <w:left w:val="single" w:color="BBBBBB" w:sz="4"/>
+              <w:bottom w:val="single" w:color="BBBBBB" w:sz="4"/>
+              <w:right w:val="single" w:color="BBBBBB" w:sz="4"/>
+            </w:tcBorders>
+            <w:tcMar>
+              <w:top w:type="dxa" w:w="60"/>
+              <w:left w:type="dxa" w:w="100"/>
+              <w:bottom w:type="dxa" w:w="60"/>
+              <w:right w:type="dxa" w:w="100"/>
+            </w:tcMar>
+          </w:tcPr>
+          <w:p>
+            <w:pPr>
+              <w:keepNext/>
+            </w:pPr>
+            <w:r>
+              <w:rPr>
+                <w:rFonts w:ascii="Arial" w:cs="Arial" w:eastAsia="Arial" w:hAnsi="Arial"/>
+                <w:b w:val="false"/>
+                <w:bCs w:val="false"/>
+                <w:sz w:val="19"/>
+                <w:szCs w:val="19"/>
+              </w:rPr>
+              <w:t xml:space="preserve">Audit results</w:t>
+            </w:r>
+          </w:p>
+        </w:tc>
+      </w:tr>
+      <w:tr>
+        <w:trPr>
+          <w:tblHeader w:val="off"/>
+        </w:trPr>
+        <w:tc>
+          <w:tcPr>
+            <w:tcW w:type="dxa" w:w="3000"/>
+            <w:tcBorders>
+              <w:top w:val="single" w:color="BBBBBB" w:sz="4"/>
+              <w:left w:val="single" w:color="BBBBBB" w:sz="4"/>
+              <w:bottom w:val="single" w:color="BBBBBB" w:sz="4"/>
+              <w:right w:val="single" w:color="BBBBBB" w:sz="4"/>
+            </w:tcBorders>
+            <w:tcMar>
+              <w:top w:type="dxa" w:w="60"/>
+              <w:left w:type="dxa" w:w="100"/>
+              <w:bottom w:type="dxa" w:w="60"/>
+              <w:right w:type="dxa" w:w="100"/>
+            </w:tcMar>
+          </w:tcPr>
+          <w:p>
+            <w:pPr>
+              <w:keepNext/>
+            </w:pPr>
+            <w:r>
+              <w:rPr>
+                <w:rFonts w:ascii="Arial" w:cs="Arial" w:eastAsia="Arial" w:hAnsi="Arial"/>
+                <w:b w:val="false"/>
+                <w:bCs w:val="false"/>
+                <w:sz w:val="19"/>
+                <w:szCs w:val="19"/>
+              </w:rPr>
+              <w:t xml:space="preserve">segment_summary.csv</w:t>
+            </w:r>
+          </w:p>
+        </w:tc>
+        <w:tc>
+          <w:tcPr>
+            <w:tcW w:type="dxa" w:w="6000"/>
+            <w:tcBorders>
+              <w:top w:val="single" w:color="BBBBBB" w:sz="4"/>
+              <w:left w:val="single" w:color="BBBBBB" w:sz="4"/>
+              <w:bottom w:val="single" w:color="BBBBBB" w:sz="4"/>
+              <w:right w:val="single" w:color="BBBBBB" w:sz="4"/>
+            </w:tcBorders>
+            <w:tcMar>
+              <w:top w:type="dxa" w:w="60"/>
+              <w:left w:type="dxa" w:w="100"/>
+              <w:bottom w:type="dxa" w:w="60"/>
+              <w:right w:type="dxa" w:w="100"/>
+            </w:tcMar>
+          </w:tcPr>
+          <w:p>
+            <w:pPr>
+              <w:keepNext/>
+            </w:pPr>
+            <w:r>
+              <w:rPr>
+                <w:rFonts w:ascii="Arial" w:cs="Arial" w:eastAsia="Arial" w:hAnsi="Arial"/>
+                <w:b w:val="false"/>
+                <w:bCs w:val="false"/>
+                <w:sz w:val="19"/>
+                <w:szCs w:val="19"/>
+              </w:rPr>
+              <w:t xml:space="preserve">Customers and CLV per recommended action</w:t>
+            </w:r>
+          </w:p>
+        </w:tc>
+      </w:tr>
+      <w:tr>
+        <w:trPr>
+          <w:tblHeader w:val="off"/>
+        </w:trPr>
+        <w:tc>
+          <w:tcPr>
+            <w:tcW w:type="dxa" w:w="3000"/>
+            <w:tcBorders>
+              <w:top w:val="single" w:color="BBBBBB" w:sz="4"/>
+              <w:left w:val="single" w:color="BBBBBB" w:sz="4"/>
+              <w:bottom w:val="single" w:color="BBBBBB" w:sz="4"/>
+              <w:right w:val="single" w:color="BBBBBB" w:sz="4"/>
+            </w:tcBorders>
+            <w:tcMar>
+              <w:top w:type="dxa" w:w="60"/>
+              <w:left w:type="dxa" w:w="100"/>
+              <w:bottom w:type="dxa" w:w="60"/>
+              <w:right w:type="dxa" w:w="100"/>
+            </w:tcMar>
+          </w:tcPr>
+          <w:p>
+            <w:pPr>
+              <w:keepNext w:val="false"/>
+            </w:pPr>
             <w:r>
               <w:rPr>
                 <w:rFonts w:ascii="Arial" w:cs="Arial" w:eastAsia="Arial" w:hAnsi="Arial"/>
@@ -9732,6 +11338,9 @@
             </w:tcMar>
           </w:tcPr>
           <w:p>
+            <w:pPr>
+              <w:keepNext w:val="false"/>
+            </w:pPr>
             <w:r>
               <w:rPr>
                 <w:rFonts w:ascii="Arial" w:cs="Arial" w:eastAsia="Arial" w:hAnsi="Arial"/>

</xml_diff>

<commit_message>
Add learner name and roll number; rename synopsis per template
</commit_message>
<xml_diff>
--- a/CLV_Project_Report.docx
+++ b/CLV_Project_Report.docx
@@ -216,7 +216,7 @@
                 <w:sz w:val="19"/>
                 <w:szCs w:val="19"/>
               </w:rPr>
-              <w:t xml:space="preserve">[FILL IN]</w:t>
+              <w:t xml:space="preserve">Atharv Dhiman</w:t>
             </w:r>
           </w:p>
         </w:tc>
@@ -285,7 +285,7 @@
                 <w:sz w:val="19"/>
                 <w:szCs w:val="19"/>
               </w:rPr>
-              <w:t xml:space="preserve">[FILL IN]</w:t>
+              <w:t xml:space="preserve">2300320130071</w:t>
             </w:r>
           </w:p>
         </w:tc>

</xml_diff>